<commit_message>
Chapitre V : section environnement de développement rédigée selon le modèle (matériels, outils, langages, frameworks)
</commit_message>
<xml_diff>
--- a/docs/Chapitre_V_Architecture_et_choix_technologiques.docx
+++ b/docs/Chapitre_V_Architecture_et_choix_technologiques.docx
@@ -3715,11 +3715,110 @@
     </w:p>
     <w:p>
       <w:pPr>
+        <w:pStyle w:val="Heading3"/>
+        <w:keepNext/>
+        <w:spacing w:after="120" w:before="240"/>
+      </w:pPr>
+      <w:r>
+        <w:rPr>
+          <w:b/>
+          <w:bCs/>
+          <w:color w:val="F79646"/>
+          <w:sz w:val="24"/>
+          <w:szCs w:val="24"/>
+        </w:rPr>
+        <w:t xml:space="preserve">1. Matériels utilisés</w:t>
+      </w:r>
+    </w:p>
+    <w:p>
+      <w:pPr>
         <w:spacing w:after="140" w:line="300"/>
         <w:jc w:val="both"/>
       </w:pPr>
       <w:r>
-        <w:t xml:space="preserve">La plateforme a été développée sur un ordinateur portable Apple fonctionnant sous macOS. Tous les outils ont été installés localement avec le gestionnaire de paquets Homebrew, ce qui donne un environnement facile à reproduire sur une autre machine. Le code a été écrit avec l'éditeur Visual Studio Code. Pendant le développement, l'application s'exécute sur le serveur intégré de Laravel, à l'adresse locale sur le port 8000, avec PHP 8.5 et Composer pour installer les bibliothèques PHP. La base de données tourne sur MariaDB 13.0.2, consultée avec phpMyAdmin sur le port 8081. Node.js et npm servent aux outils de mise en forme du code, et Laravel Pint veille au respect d'un style commun. La figure 5 résume cet environnement.</w:t>
+        <w:t xml:space="preserve">Pour la réalisation du projet, nous avons utilisé un ordinateur portable ayant les caractéristiques suivantes :</w:t>
+      </w:r>
+    </w:p>
+    <w:p>
+      <w:pPr>
+        <w:pStyle w:val="ListParagraph"/>
+        <w:numPr>
+          <w:ilvl w:val="0"/>
+          <w:numId w:val="2"/>
+        </w:numPr>
+        <w:spacing w:after="80" w:line="290"/>
+        <w:jc w:val="both"/>
+      </w:pPr>
+      <w:r>
+        <w:t xml:space="preserve">Modèle : MacBook Neo (Apple)</w:t>
+      </w:r>
+    </w:p>
+    <w:p>
+      <w:pPr>
+        <w:pStyle w:val="ListParagraph"/>
+        <w:numPr>
+          <w:ilvl w:val="0"/>
+          <w:numId w:val="2"/>
+        </w:numPr>
+        <w:spacing w:after="80" w:line="290"/>
+        <w:jc w:val="both"/>
+      </w:pPr>
+      <w:r>
+        <w:t xml:space="preserve">Système d'exploitation : macOS 27.0</w:t>
+      </w:r>
+    </w:p>
+    <w:p>
+      <w:pPr>
+        <w:pStyle w:val="ListParagraph"/>
+        <w:numPr>
+          <w:ilvl w:val="0"/>
+          <w:numId w:val="2"/>
+        </w:numPr>
+        <w:spacing w:after="80" w:line="290"/>
+        <w:jc w:val="both"/>
+      </w:pPr>
+      <w:r>
+        <w:t xml:space="preserve">Processeur : puce Apple A18 Pro, 6 cœurs (2 cœurs performants et 4 cœurs économes)</w:t>
+      </w:r>
+    </w:p>
+    <w:p>
+      <w:pPr>
+        <w:pStyle w:val="ListParagraph"/>
+        <w:numPr>
+          <w:ilvl w:val="0"/>
+          <w:numId w:val="2"/>
+        </w:numPr>
+        <w:spacing w:after="80" w:line="290"/>
+        <w:jc w:val="both"/>
+      </w:pPr>
+      <w:r>
+        <w:t xml:space="preserve">Mémoire vive (RAM) : 8 Go</w:t>
+      </w:r>
+    </w:p>
+    <w:p>
+      <w:pPr>
+        <w:pStyle w:val="Heading3"/>
+        <w:keepNext/>
+        <w:spacing w:after="120" w:before="240"/>
+      </w:pPr>
+      <w:r>
+        <w:rPr>
+          <w:b/>
+          <w:bCs/>
+          <w:color w:val="F79646"/>
+          <w:sz w:val="24"/>
+          <w:szCs w:val="24"/>
+        </w:rPr>
+        <w:t xml:space="preserve">2. Outils et technologies utilisés</w:t>
+      </w:r>
+    </w:p>
+    <w:p>
+      <w:pPr>
+        <w:spacing w:after="140" w:line="300"/>
+        <w:jc w:val="both"/>
+      </w:pPr>
+      <w:r>
+        <w:t xml:space="preserve">La réalisation de notre application a été rendue possible grâce à l'utilisation d'un ensemble d'outils. Parmi ces outils essentiels figurent : un éditeur de code [Visual Studio Code], un système de gestion de base de données [MariaDB] administré avec [phpMyAdmin], un gestionnaire de versions [Git et GitHub] et un outil de dessin de schémas [Mermaid]. La figure 5 résume l'ensemble de cet environnement.</w:t>
       </w:r>
     </w:p>
     <w:p>
@@ -3786,164 +3885,19 @@
     </w:p>
     <w:p>
       <w:pPr>
-        <w:spacing w:after="140" w:line="300"/>
-        <w:jc w:val="both"/>
-      </w:pPr>
-      <w:r>
-        <w:t xml:space="preserve">Le code est versionné avec </w:t>
-      </w:r>
-      <w:r>
-        <w:rPr>
-          <w:b/>
-          <w:bCs/>
-        </w:rPr>
-        <w:t xml:space="preserve">Git</w:t>
-      </w:r>
-      <w:r>
-        <w:t xml:space="preserve"> et sauvegardé en ligne sur </w:t>
-      </w:r>
-      <w:r>
-        <w:rPr>
-          <w:b/>
-          <w:bCs/>
-        </w:rPr>
-        <w:t xml:space="preserve">GitHub</w:t>
-      </w:r>
-      <w:r>
-        <w:t xml:space="preserve">. Chaque fonctionnalité a fait l'objet d'un commit, ce qui conserve tout l'historique des modifications et permet de revenir en arrière en cas de problème.</w:t>
-      </w:r>
-    </w:p>
-    <w:p>
-      <w:pPr>
-        <w:spacing w:after="140" w:line="300"/>
-        <w:jc w:val="both"/>
-      </w:pPr>
-      <w:r>
-        <w:t xml:space="preserve">Le code est organisé de façon classique pour un projet Laravel :</w:t>
-      </w:r>
-    </w:p>
-    <w:p>
-      <w:pPr>
-        <w:pStyle w:val="ListParagraph"/>
-        <w:numPr>
-          <w:ilvl w:val="0"/>
-          <w:numId w:val="2"/>
-        </w:numPr>
-        <w:spacing w:after="80" w:line="290"/>
-        <w:jc w:val="both"/>
-      </w:pPr>
-      <w:r>
-        <w:t xml:space="preserve">le dossier app contient les contrôleurs, les modèles, les services qui portent les règles des circuits et les notifications ;</w:t>
-      </w:r>
-    </w:p>
-    <w:p>
-      <w:pPr>
-        <w:pStyle w:val="ListParagraph"/>
-        <w:numPr>
-          <w:ilvl w:val="0"/>
-          <w:numId w:val="2"/>
-        </w:numPr>
-        <w:spacing w:after="80" w:line="290"/>
-        <w:jc w:val="both"/>
-      </w:pPr>
-      <w:r>
-        <w:t xml:space="preserve">le dossier database regroupe les migrations, les jeux de données de départ et l'export SQL de la base ;</w:t>
-      </w:r>
-    </w:p>
-    <w:p>
-      <w:pPr>
-        <w:pStyle w:val="ListParagraph"/>
-        <w:numPr>
-          <w:ilvl w:val="0"/>
-          <w:numId w:val="2"/>
-        </w:numPr>
-        <w:spacing w:after="80" w:line="290"/>
-        <w:jc w:val="both"/>
-      </w:pPr>
-      <w:r>
-        <w:t xml:space="preserve">le dossier routes contient les adresses de l'API ;</w:t>
-      </w:r>
-    </w:p>
-    <w:p>
-      <w:pPr>
-        <w:pStyle w:val="ListParagraph"/>
-        <w:numPr>
-          <w:ilvl w:val="0"/>
-          <w:numId w:val="2"/>
-        </w:numPr>
-        <w:spacing w:after="80" w:line="290"/>
-        <w:jc w:val="both"/>
-      </w:pPr>
-      <w:r>
-        <w:t xml:space="preserve">le dossier public contient l'interface des différents espaces ;</w:t>
-      </w:r>
-    </w:p>
-    <w:p>
-      <w:pPr>
-        <w:pStyle w:val="ListParagraph"/>
-        <w:numPr>
-          <w:ilvl w:val="0"/>
-          <w:numId w:val="2"/>
-        </w:numPr>
-        <w:spacing w:after="80" w:line="290"/>
-        <w:jc w:val="both"/>
-      </w:pPr>
-      <w:r>
-        <w:t xml:space="preserve">le dossier tests contient les tests automatiques ;</w:t>
-      </w:r>
-    </w:p>
-    <w:p>
-      <w:pPr>
-        <w:pStyle w:val="ListParagraph"/>
-        <w:numPr>
-          <w:ilvl w:val="0"/>
-          <w:numId w:val="2"/>
-        </w:numPr>
-        <w:spacing w:after="80" w:line="290"/>
-        <w:jc w:val="both"/>
-      </w:pPr>
-      <w:r>
-        <w:t xml:space="preserve">le dossier docs conserve la documentation de conception, avec les modèles Merise.</w:t>
-      </w:r>
-    </w:p>
-    <w:p>
-      <w:pPr>
-        <w:spacing w:after="140" w:line="300"/>
-        <w:jc w:val="both"/>
-      </w:pPr>
-      <w:r>
-        <w:t xml:space="preserve">Les tests automatiques vérifient les circuits complets et les droits de chaque rôle. Ils sont au nombre de 55 et contrôlent 279 points. Par exemple, ils vérifient qu'une demande de plus de deux jours passe directement du gestionnaire RH au DRH, qu'un Directeur ne peut pas viser la demande d'un agent d'une autre structure, ou qu'un compte suspendu ne peut plus se connecter. Ils tournent en quelques secondes et sont relancés après chaque modification importante.</w:t>
-      </w:r>
-    </w:p>
-    <w:p>
-      <w:pPr>
-        <w:spacing w:after="140" w:line="300"/>
-        <w:jc w:val="both"/>
-      </w:pPr>
-      <w:r>
-        <w:t xml:space="preserve">Pour installer la plateforme sur une autre machine, il suffit de récupérer le dépôt, d'installer les dépendances avec Composer, de renseigner dans le fichier de configuration l'accès à la base de données, puis de lancer la création des tables et le chargement des données de départ. Le serveur de développement démarre ensuite avec une seule commande, et l'application est accessible depuis le navigateur.</w:t>
-      </w:r>
-    </w:p>
-    <w:p>
-      <w:r>
-        <w:br w:type="page"/>
-      </w:r>
-    </w:p>
-    <w:p>
-      <w:pPr>
-        <w:pStyle w:val="Heading2"/>
+        <w:pStyle w:val="Heading3"/>
         <w:keepNext/>
-        <w:spacing w:after="180" w:before="360"/>
+        <w:spacing w:after="120" w:before="240"/>
       </w:pPr>
       <w:r>
         <w:rPr>
           <w:b/>
           <w:bCs/>
           <w:color w:val="F79646"/>
-          <w:sz w:val="26"/>
-          <w:szCs w:val="26"/>
-        </w:rPr>
-        <w:t xml:space="preserve">ANNEXE : MODÈLE PHYSIQUE DES DONNÉES PAR DOMAINE</w:t>
+          <w:sz w:val="24"/>
+          <w:szCs w:val="24"/>
+        </w:rPr>
+        <w:t xml:space="preserve">2.1. Visual Studio Code [Éditeur de code]</w:t>
       </w:r>
     </w:p>
     <w:p>
@@ -3952,7 +3906,295 @@
         <w:jc w:val="both"/>
       </w:pPr>
       <w:r>
-        <w:t xml:space="preserve">Les figures suivantes détaillent toutes les colonnes de chaque table, domaine par domaine. Le domaine des permissions est présenté à la figure 3. Les tables représentées en pointillés ne montrent que leur clé primaire : elles sont décrites dans le premier domaine.</w:t>
+        <w:t xml:space="preserve">Plus connu sous le nom de VS Code, Visual Studio Code est un éditeur de code source développé par Microsoft pour les systèmes d'exploitation Windows, Linux et macOS. Il permet de développer dans de nombreux langages de programmation, tels que HTML, CSS, JavaScript, PHP et bien d'autres. Doté de nombreuses fonctionnalités avancées, il facilite la programmation en offrant des outils tels que la complétion intelligente du code, la mise en évidence de la syntaxe, la recherche dans tout le projet, l'intégration de Git et un terminal intégré. Il a été l'éditeur avec lequel l'ensemble du code de la plateforme a été écrit et relu.</w:t>
+      </w:r>
+    </w:p>
+    <w:p>
+      <w:pPr>
+        <w:pStyle w:val="Heading3"/>
+        <w:keepNext/>
+        <w:spacing w:after="120" w:before="240"/>
+      </w:pPr>
+      <w:r>
+        <w:rPr>
+          <w:b/>
+          <w:bCs/>
+          <w:color w:val="F79646"/>
+          <w:sz w:val="24"/>
+          <w:szCs w:val="24"/>
+        </w:rPr>
+        <w:t xml:space="preserve">2.2. MariaDB et phpMyAdmin [Système de gestion de base de données]</w:t>
+      </w:r>
+    </w:p>
+    <w:p>
+      <w:pPr>
+        <w:spacing w:after="140" w:line="300"/>
+        <w:jc w:val="both"/>
+      </w:pPr>
+      <w:r>
+        <w:t xml:space="preserve">MariaDB est un système de gestion de bases de données relationnelles libre et gratuit. Il a été créé en 2009 par Michael Widenius, l'un des concepteurs de MySQL, à partir du code de ce dernier, et il en reste compatible : les mêmes requêtes SQL et les mêmes outils fonctionnent avec les deux. Il est réputé pour sa fiabilité, ses performances et sa facilité d'utilisation. Son moteur InnoDB gère les transactions et l'intégrité des données, ce qui est indispensable pour des dossiers officiels dont l'historique doit rester fiable. Dans notre cas, nous avons choisi MariaDB pour le développement de notre application en raison de sa robustesse, de sa gratuité et de sa compatibilité avec Laravel.</w:t>
+      </w:r>
+    </w:p>
+    <w:p>
+      <w:pPr>
+        <w:spacing w:after="140" w:line="300"/>
+        <w:jc w:val="both"/>
+      </w:pPr>
+      <w:r>
+        <w:t xml:space="preserve">phpMyAdmin est une interface web, écrite en PHP, qui permet d'administrer une base de données MySQL ou MariaDB sans écrire de commandes : consultation des tables, exécution de requêtes, import et export de la base. Elle a servi à vérifier les données pendant le développement et à produire l'export SQL du projet. Nous utilisons MariaDB 13.0.2 et phpMyAdmin 5.2.3.</w:t>
+      </w:r>
+    </w:p>
+    <w:p>
+      <w:pPr>
+        <w:pStyle w:val="Heading3"/>
+        <w:keepNext/>
+        <w:spacing w:after="120" w:before="240"/>
+      </w:pPr>
+      <w:r>
+        <w:rPr>
+          <w:b/>
+          <w:bCs/>
+          <w:color w:val="F79646"/>
+          <w:sz w:val="24"/>
+          <w:szCs w:val="24"/>
+        </w:rPr>
+        <w:t xml:space="preserve">2.3. Git et GitHub [Gestion des versions]</w:t>
+      </w:r>
+    </w:p>
+    <w:p>
+      <w:pPr>
+        <w:spacing w:after="140" w:line="300"/>
+        <w:jc w:val="both"/>
+      </w:pPr>
+      <w:r>
+        <w:t xml:space="preserve">Git est un logiciel de gestion de versions créé en 2005 par Linus Torvalds, le concepteur du noyau Linux. Il enregistre l'historique de toutes les modifications du code et permet de revenir à une version antérieure en cas de problème. GitHub est un service en ligne qui héberge des dépôts Git ; il a été lancé en 2008 et appartient à Microsoft depuis 2018. Nous avons créé un commit pour chaque fonctionnalité de la plateforme et nous avons sauvegardé le dépôt sur GitHub, ce qui protège le projet et conserve tout son historique.</w:t>
+      </w:r>
+    </w:p>
+    <w:p>
+      <w:pPr>
+        <w:pStyle w:val="Heading3"/>
+        <w:keepNext/>
+        <w:spacing w:after="120" w:before="240"/>
+      </w:pPr>
+      <w:r>
+        <w:rPr>
+          <w:b/>
+          <w:bCs/>
+          <w:color w:val="F79646"/>
+          <w:sz w:val="24"/>
+          <w:szCs w:val="24"/>
+        </w:rPr>
+        <w:t xml:space="preserve">2.4. Composer et Homebrew [Gestionnaires de paquets]</w:t>
+      </w:r>
+    </w:p>
+    <w:p>
+      <w:pPr>
+        <w:spacing w:after="140" w:line="300"/>
+        <w:jc w:val="both"/>
+      </w:pPr>
+      <w:r>
+        <w:t xml:space="preserve">Composer est le gestionnaire de dépendances de PHP. Il installe et met à jour les bibliothèques dont un projet a besoin, comme Laravel, à partir d'un simple fichier de description. Homebrew est le gestionnaire de paquets de macOS : il nous a permis d'installer PHP, MariaDB, phpMyAdmin, Node.js et Git avec une seule commande chacun, et de reproduire facilement le même environnement sur une autre machine.</w:t>
+      </w:r>
+    </w:p>
+    <w:p>
+      <w:pPr>
+        <w:pStyle w:val="Heading3"/>
+        <w:keepNext/>
+        <w:spacing w:after="120" w:before="240"/>
+      </w:pPr>
+      <w:r>
+        <w:rPr>
+          <w:b/>
+          <w:bCs/>
+          <w:color w:val="F79646"/>
+          <w:sz w:val="24"/>
+          <w:szCs w:val="24"/>
+        </w:rPr>
+        <w:t xml:space="preserve">2.5. Mermaid [Outil de dessin de schémas]</w:t>
+      </w:r>
+    </w:p>
+    <w:p>
+      <w:pPr>
+        <w:spacing w:after="140" w:line="300"/>
+        <w:jc w:val="both"/>
+      </w:pPr>
+      <w:r>
+        <w:t xml:space="preserve">Mermaid est un outil qui dessine des schémas à partir d'un texte : on décrit les éléments et leurs liens, et un moteur se charge de la mise en page. Il est gratuit et fonctionne dans un navigateur web. Nous l'avons utilisé pour les modèles conceptuels et organisationnels de la méthode Merise (MCD, MCT et MOT). Les schémas du modèle physique des données, eux, sont générés à partir de la structure réelle de la base, ce qui garantit qu'ils correspondent exactement à ce qui est installé.</w:t>
+      </w:r>
+    </w:p>
+    <w:p>
+      <w:pPr>
+        <w:pStyle w:val="Heading3"/>
+        <w:keepNext/>
+        <w:spacing w:after="120" w:before="240"/>
+      </w:pPr>
+      <w:r>
+        <w:rPr>
+          <w:b/>
+          <w:bCs/>
+          <w:color w:val="F79646"/>
+          <w:sz w:val="24"/>
+          <w:szCs w:val="24"/>
+        </w:rPr>
+        <w:t xml:space="preserve">2.6. Langages de développement</w:t>
+      </w:r>
+    </w:p>
+    <w:p>
+      <w:pPr>
+        <w:spacing w:after="140" w:line="300"/>
+        <w:jc w:val="both"/>
+      </w:pPr>
+      <w:r>
+        <w:rPr>
+          <w:b/>
+          <w:bCs/>
+        </w:rPr>
+        <w:t xml:space="preserve">1. HTML</w:t>
+      </w:r>
+    </w:p>
+    <w:p>
+      <w:pPr>
+        <w:spacing w:after="140" w:line="300"/>
+        <w:jc w:val="both"/>
+      </w:pPr>
+      <w:r>
+        <w:t xml:space="preserve">HTML (HyperText Markup Language) est un langage de balisage utilisé pour structurer le contenu des pages web : titres, paragraphes, tableaux, formulaires et images. Il a été inventé au début des années 1990 par Tim Berners-Lee. Chaque écran de la plateforme, du formulaire de connexion aux tableaux de dossiers, est une page HTML.</w:t>
+      </w:r>
+    </w:p>
+    <w:p>
+      <w:pPr>
+        <w:spacing w:after="140" w:line="300"/>
+        <w:jc w:val="both"/>
+      </w:pPr>
+      <w:r>
+        <w:rPr>
+          <w:b/>
+          <w:bCs/>
+        </w:rPr>
+        <w:t xml:space="preserve">2. CSS</w:t>
+      </w:r>
+    </w:p>
+    <w:p>
+      <w:pPr>
+        <w:spacing w:after="140" w:line="300"/>
+        <w:jc w:val="both"/>
+      </w:pPr>
+      <w:r>
+        <w:t xml:space="preserve">CSS (Cascading Style Sheets) est un langage de style pour les pages web. Il contrôle l'apparence des éléments : couleurs, polices, marges et disposition. Il donne à la plateforme un style sobre et cohérent, avec les couleurs du drapeau ivoirien en bandeau et un affichage adapté aux écrans de téléphone comme d'ordinateur.</w:t>
+      </w:r>
+    </w:p>
+    <w:p>
+      <w:pPr>
+        <w:spacing w:after="140" w:line="300"/>
+        <w:jc w:val="both"/>
+      </w:pPr>
+      <w:r>
+        <w:rPr>
+          <w:b/>
+          <w:bCs/>
+        </w:rPr>
+        <w:t xml:space="preserve">3. JavaScript</w:t>
+      </w:r>
+    </w:p>
+    <w:p>
+      <w:pPr>
+        <w:spacing w:after="140" w:line="300"/>
+        <w:jc w:val="both"/>
+      </w:pPr>
+      <w:r>
+        <w:t xml:space="preserve">JavaScript est le langage qui rend les pages web interactives. Il réagit aux actions de l'utilisateur, envoie des requêtes au serveur sans recharger la page et met à jour le contenu affiché. Dans notre application, il affiche les listes de dossiers, envoie les formulaires, gère les notifications et dessine les graphiques du tableau de bord grâce à la bibliothèque Chart.js. Il fonctionne dans tous les navigateurs actuels.</w:t>
+      </w:r>
+    </w:p>
+    <w:p>
+      <w:pPr>
+        <w:spacing w:after="140" w:line="300"/>
+        <w:jc w:val="both"/>
+      </w:pPr>
+      <w:r>
+        <w:rPr>
+          <w:b/>
+          <w:bCs/>
+        </w:rPr>
+        <w:t xml:space="preserve">4. PHP</w:t>
+      </w:r>
+    </w:p>
+    <w:p>
+      <w:pPr>
+        <w:spacing w:after="140" w:line="300"/>
+        <w:jc w:val="both"/>
+      </w:pPr>
+      <w:r>
+        <w:t xml:space="preserve">PHP, qui signifie « PHP: Hypertext Preprocessor », est un langage de programmation web polyvalent et très répandu, créé par Rasmus Lerdorf au milieu des années 1990. Il s'exécute sur le serveur : il reçoit les demandes, applique les règles de l'application, dialogue avec la base de données et renvoie la réponse. Il bénéficie d'une grande communauté de développeurs et il est pris en charge par presque tous les hébergeurs. Nous utilisons la version 8.5, qui permet de typer les données échangées entre les fonctions et évite ainsi de nombreuses erreurs.</w:t>
+      </w:r>
+    </w:p>
+    <w:p>
+      <w:pPr>
+        <w:pStyle w:val="Heading3"/>
+        <w:keepNext/>
+        <w:spacing w:after="120" w:before="240"/>
+      </w:pPr>
+      <w:r>
+        <w:rPr>
+          <w:b/>
+          <w:bCs/>
+          <w:color w:val="F79646"/>
+          <w:sz w:val="24"/>
+          <w:szCs w:val="24"/>
+        </w:rPr>
+        <w:t xml:space="preserve">2.7. Frameworks utilisés</w:t>
+      </w:r>
+    </w:p>
+    <w:p>
+      <w:pPr>
+        <w:spacing w:after="140" w:line="300"/>
+        <w:jc w:val="both"/>
+      </w:pPr>
+      <w:r>
+        <w:rPr>
+          <w:b/>
+          <w:bCs/>
+        </w:rPr>
+        <w:t xml:space="preserve">1. Tailwind CSS</w:t>
+      </w:r>
+    </w:p>
+    <w:p>
+      <w:pPr>
+        <w:spacing w:after="140" w:line="300"/>
+        <w:jc w:val="both"/>
+      </w:pPr>
+      <w:r>
+        <w:t xml:space="preserve">Tailwind CSS est un cadre de développement pour le style des pages, qui fournit de petites classes prêtes à l'emploi (couleurs, espacements, tailles, alignements) que l'on combine directement dans le code HTML. Il permet de construire rapidement des mises en page modernes et adaptées à tous les écrans, sans écrire de longues feuilles de style. Nous l'avons retenu pour l'homogénéité de l'interface : tous les espaces de la plateforme partagent les mêmes couleurs, les mêmes boutons et les mêmes tableaux.</w:t>
+      </w:r>
+    </w:p>
+    <w:p>
+      <w:pPr>
+        <w:spacing w:after="140" w:line="300"/>
+        <w:jc w:val="both"/>
+      </w:pPr>
+      <w:r>
+        <w:rPr>
+          <w:b/>
+          <w:bCs/>
+        </w:rPr>
+        <w:t xml:space="preserve">2. Laravel</w:t>
+      </w:r>
+    </w:p>
+    <w:p>
+      <w:pPr>
+        <w:spacing w:after="140" w:line="300"/>
+        <w:jc w:val="both"/>
+      </w:pPr>
+      <w:r>
+        <w:t xml:space="preserve">Laravel est un cadre de développement PHP libre, créé en 2011 par Taylor Otwell et très utilisé pour les applications web et les API. Il repose sur une architecture MVC (Modèle, Vue, Contrôleur) et s'appuie sur plusieurs composants du cadre Symfony. Il propose de nombreuses fonctionnalités prêtes à l'emploi : gestion des routes, validation des formulaires, authentification des utilisateurs, accès à la base de données avec l'outil Eloquent, migrations, notifications et envoi d'emails. Nous utilisons la version 13. Il est choisi par de nombreux développeurs pour sa clarté, sa sécurité et sa communauté active.</w:t>
+      </w:r>
+    </w:p>
+    <w:p>
+      <w:pPr>
+        <w:spacing w:after="140" w:line="300"/>
+        <w:jc w:val="both"/>
+      </w:pPr>
+      <w:r>
+        <w:t xml:space="preserve">La figure 6 résume les relations entre les composants de l'architecture MVC telle que nous l'utilisons. Le contrôleur reçoit la requête de l'utilisateur, la valide et interroge le modèle ; le modèle lit et écrit dans la base de données puis renvoie les données au contrôleur ; le contrôleur choisit enfin la vue, c'est-à-dire la page HTML ou la réponse JSON, qui est renvoyée à l'utilisateur.</w:t>
       </w:r>
     </w:p>
     <w:p>
@@ -3964,9 +4206,9 @@
       <w:r>
         <w:drawing>
           <wp:inline distT="0" distB="0" distL="0" distR="0">
-            <wp:extent cx="5715000" cy="4257675"/>
+            <wp:extent cx="5715000" cy="2143125"/>
             <wp:effectExtent t="0" r="0" b="0" l="0"/>
-            <wp:docPr id="1" name="MPD-1-organisation.png" descr="MPD-1-organisation.png" title="MPD-1-organisation.png"/>
+            <wp:docPr id="1" name="ARCH-3-mvc.png" descr="ARCH-3-mvc.png" title="ARCH-3-mvc.png"/>
             <wp:cNvGraphicFramePr>
               <a:graphicFrameLocks xmlns:a="http://schemas.openxmlformats.org/drawingml/2006/main" noChangeAspect="1"/>
             </wp:cNvGraphicFramePr>
@@ -3989,7 +4231,7 @@
                   <pic:spPr bwMode="auto">
                     <a:xfrm>
                       <a:off x="0" y="0"/>
-                      <a:ext cx="5715000" cy="4257675"/>
+                      <a:ext cx="5715000" cy="2143125"/>
                     </a:xfrm>
                     <a:prstGeom prst="rect">
                       <a:avLst/>
@@ -4014,7 +4256,166 @@
           <w:sz w:val="21"/>
           <w:szCs w:val="21"/>
         </w:rPr>
-        <w:t xml:space="preserve">Figure A1 : Organisation, comptes et droits</w:t>
+        <w:t xml:space="preserve">Figure 6 : Architecture MVC de la plateforme</w:t>
+      </w:r>
+    </w:p>
+    <w:p>
+      <w:pPr>
+        <w:pStyle w:val="Heading3"/>
+        <w:keepNext/>
+        <w:spacing w:after="120" w:before="240"/>
+      </w:pPr>
+      <w:r>
+        <w:rPr>
+          <w:b/>
+          <w:bCs/>
+          <w:color w:val="F79646"/>
+          <w:sz w:val="24"/>
+          <w:szCs w:val="24"/>
+        </w:rPr>
+        <w:t xml:space="preserve">3. Organisation du code et tests</w:t>
+      </w:r>
+    </w:p>
+    <w:p>
+      <w:pPr>
+        <w:spacing w:after="140" w:line="300"/>
+        <w:jc w:val="both"/>
+      </w:pPr>
+      <w:r>
+        <w:t xml:space="preserve">Le code est organisé de façon classique pour un projet Laravel :</w:t>
+      </w:r>
+    </w:p>
+    <w:p>
+      <w:pPr>
+        <w:pStyle w:val="ListParagraph"/>
+        <w:numPr>
+          <w:ilvl w:val="0"/>
+          <w:numId w:val="2"/>
+        </w:numPr>
+        <w:spacing w:after="80" w:line="290"/>
+        <w:jc w:val="both"/>
+      </w:pPr>
+      <w:r>
+        <w:t xml:space="preserve">le dossier app contient les contrôleurs, les modèles, les services qui portent les règles des circuits et les notifications ;</w:t>
+      </w:r>
+    </w:p>
+    <w:p>
+      <w:pPr>
+        <w:pStyle w:val="ListParagraph"/>
+        <w:numPr>
+          <w:ilvl w:val="0"/>
+          <w:numId w:val="2"/>
+        </w:numPr>
+        <w:spacing w:after="80" w:line="290"/>
+        <w:jc w:val="both"/>
+      </w:pPr>
+      <w:r>
+        <w:t xml:space="preserve">le dossier database regroupe les migrations, les jeux de données de départ et l'export SQL de la base ;</w:t>
+      </w:r>
+    </w:p>
+    <w:p>
+      <w:pPr>
+        <w:pStyle w:val="ListParagraph"/>
+        <w:numPr>
+          <w:ilvl w:val="0"/>
+          <w:numId w:val="2"/>
+        </w:numPr>
+        <w:spacing w:after="80" w:line="290"/>
+        <w:jc w:val="both"/>
+      </w:pPr>
+      <w:r>
+        <w:t xml:space="preserve">le dossier routes contient les adresses de l'API ;</w:t>
+      </w:r>
+    </w:p>
+    <w:p>
+      <w:pPr>
+        <w:pStyle w:val="ListParagraph"/>
+        <w:numPr>
+          <w:ilvl w:val="0"/>
+          <w:numId w:val="2"/>
+        </w:numPr>
+        <w:spacing w:after="80" w:line="290"/>
+        <w:jc w:val="both"/>
+      </w:pPr>
+      <w:r>
+        <w:t xml:space="preserve">le dossier public contient l'interface des différents espaces ;</w:t>
+      </w:r>
+    </w:p>
+    <w:p>
+      <w:pPr>
+        <w:pStyle w:val="ListParagraph"/>
+        <w:numPr>
+          <w:ilvl w:val="0"/>
+          <w:numId w:val="2"/>
+        </w:numPr>
+        <w:spacing w:after="80" w:line="290"/>
+        <w:jc w:val="both"/>
+      </w:pPr>
+      <w:r>
+        <w:t xml:space="preserve">le dossier tests contient les tests automatiques ;</w:t>
+      </w:r>
+    </w:p>
+    <w:p>
+      <w:pPr>
+        <w:pStyle w:val="ListParagraph"/>
+        <w:numPr>
+          <w:ilvl w:val="0"/>
+          <w:numId w:val="2"/>
+        </w:numPr>
+        <w:spacing w:after="80" w:line="290"/>
+        <w:jc w:val="both"/>
+      </w:pPr>
+      <w:r>
+        <w:t xml:space="preserve">le dossier docs conserve la documentation de conception, avec les modèles Merise.</w:t>
+      </w:r>
+    </w:p>
+    <w:p>
+      <w:pPr>
+        <w:spacing w:after="140" w:line="300"/>
+        <w:jc w:val="both"/>
+      </w:pPr>
+      <w:r>
+        <w:t xml:space="preserve">Les tests automatiques, exécutés avec PHPUnit 12.5, vérifient les circuits complets et les droits de chaque rôle. Ils sont au nombre de 55 et contrôlent 279 points. Par exemple, ils vérifient qu'une demande de plus de deux jours passe directement du gestionnaire RH au DRH, qu'un Directeur ne peut pas viser la demande d'un agent d'une autre structure, ou qu'un compte suspendu ne peut plus se connecter. Ils tournent en quelques secondes et sont relancés après chaque modification importante. Le style du code est contrôlé par l'outil Laravel Pint.</w:t>
+      </w:r>
+    </w:p>
+    <w:p>
+      <w:pPr>
+        <w:spacing w:after="140" w:line="300"/>
+        <w:jc w:val="both"/>
+      </w:pPr>
+      <w:r>
+        <w:t xml:space="preserve">Pour installer la plateforme sur une autre machine, il suffit de récupérer le dépôt, d'installer les dépendances avec Composer, de renseigner dans le fichier de configuration l'accès à la base de données, puis de lancer la création des tables et le chargement des données de départ. Le serveur de développement démarre ensuite avec une seule commande, à l'adresse locale sur le port 8000, et l'application est accessible depuis le navigateur.</w:t>
+      </w:r>
+    </w:p>
+    <w:p>
+      <w:r>
+        <w:br w:type="page"/>
+      </w:r>
+    </w:p>
+    <w:p>
+      <w:pPr>
+        <w:pStyle w:val="Heading2"/>
+        <w:keepNext/>
+        <w:spacing w:after="180" w:before="360"/>
+      </w:pPr>
+      <w:r>
+        <w:rPr>
+          <w:b/>
+          <w:bCs/>
+          <w:color w:val="F79646"/>
+          <w:sz w:val="26"/>
+          <w:szCs w:val="26"/>
+        </w:rPr>
+        <w:t xml:space="preserve">ANNEXE : MODÈLE PHYSIQUE DES DONNÉES PAR DOMAINE</w:t>
+      </w:r>
+    </w:p>
+    <w:p>
+      <w:pPr>
+        <w:spacing w:after="140" w:line="300"/>
+        <w:jc w:val="both"/>
+      </w:pPr>
+      <w:r>
+        <w:t xml:space="preserve">Les figures suivantes détaillent toutes les colonnes de chaque table, domaine par domaine. Le domaine des permissions est présenté à la figure 3. Les tables représentées en pointillés ne montrent que leur clé primaire : elles sont décrites dans le premier domaine.</w:t>
       </w:r>
     </w:p>
     <w:p>
@@ -4026,9 +4427,9 @@
       <w:r>
         <w:drawing>
           <wp:inline distT="0" distB="0" distL="0" distR="0">
-            <wp:extent cx="5715000" cy="4143375"/>
+            <wp:extent cx="5715000" cy="4257675"/>
             <wp:effectExtent t="0" r="0" b="0" l="0"/>
-            <wp:docPr id="1" name="MPD-3-etat-civil.png" descr="MPD-3-etat-civil.png" title="MPD-3-etat-civil.png"/>
+            <wp:docPr id="1" name="MPD-1-organisation.png" descr="MPD-1-organisation.png" title="MPD-1-organisation.png"/>
             <wp:cNvGraphicFramePr>
               <a:graphicFrameLocks xmlns:a="http://schemas.openxmlformats.org/drawingml/2006/main" noChangeAspect="1"/>
             </wp:cNvGraphicFramePr>
@@ -4051,7 +4452,7 @@
                   <pic:spPr bwMode="auto">
                     <a:xfrm>
                       <a:off x="0" y="0"/>
-                      <a:ext cx="5715000" cy="4143375"/>
+                      <a:ext cx="5715000" cy="4257675"/>
                     </a:xfrm>
                     <a:prstGeom prst="rect">
                       <a:avLst/>
@@ -4076,7 +4477,7 @@
           <w:sz w:val="21"/>
           <w:szCs w:val="21"/>
         </w:rPr>
-        <w:t xml:space="preserve">Figure A2 : Déclarations de naissance et de décès</w:t>
+        <w:t xml:space="preserve">Figure A1 : Organisation, comptes et droits</w:t>
       </w:r>
     </w:p>
     <w:p>
@@ -4088,9 +4489,9 @@
       <w:r>
         <w:drawing>
           <wp:inline distT="0" distB="0" distL="0" distR="0">
-            <wp:extent cx="5715000" cy="2247900"/>
+            <wp:extent cx="5715000" cy="4143375"/>
             <wp:effectExtent t="0" r="0" b="0" l="0"/>
-            <wp:docPr id="1" name="MPD-4-notes-de-service.png" descr="MPD-4-notes-de-service.png" title="MPD-4-notes-de-service.png"/>
+            <wp:docPr id="1" name="MPD-3-etat-civil.png" descr="MPD-3-etat-civil.png" title="MPD-3-etat-civil.png"/>
             <wp:cNvGraphicFramePr>
               <a:graphicFrameLocks xmlns:a="http://schemas.openxmlformats.org/drawingml/2006/main" noChangeAspect="1"/>
             </wp:cNvGraphicFramePr>
@@ -4113,6 +4514,68 @@
                   <pic:spPr bwMode="auto">
                     <a:xfrm>
                       <a:off x="0" y="0"/>
+                      <a:ext cx="5715000" cy="4143375"/>
+                    </a:xfrm>
+                    <a:prstGeom prst="rect">
+                      <a:avLst/>
+                    </a:prstGeom>
+                  </pic:spPr>
+                </pic:pic>
+              </a:graphicData>
+            </a:graphic>
+          </wp:inline>
+        </w:drawing>
+      </w:r>
+    </w:p>
+    <w:p>
+      <w:pPr>
+        <w:spacing w:after="220" w:before="100"/>
+        <w:jc w:val="center"/>
+      </w:pPr>
+      <w:r>
+        <w:rPr>
+          <w:i/>
+          <w:iCs/>
+          <w:sz w:val="21"/>
+          <w:szCs w:val="21"/>
+        </w:rPr>
+        <w:t xml:space="preserve">Figure A2 : Déclarations de naissance et de décès</w:t>
+      </w:r>
+    </w:p>
+    <w:p>
+      <w:pPr>
+        <w:keepNext/>
+        <w:spacing w:after="60" w:before="120"/>
+        <w:jc w:val="center"/>
+      </w:pPr>
+      <w:r>
+        <w:drawing>
+          <wp:inline distT="0" distB="0" distL="0" distR="0">
+            <wp:extent cx="5715000" cy="2247900"/>
+            <wp:effectExtent t="0" r="0" b="0" l="0"/>
+            <wp:docPr id="1" name="MPD-4-notes-de-service.png" descr="MPD-4-notes-de-service.png" title="MPD-4-notes-de-service.png"/>
+            <wp:cNvGraphicFramePr>
+              <a:graphicFrameLocks xmlns:a="http://schemas.openxmlformats.org/drawingml/2006/main" noChangeAspect="1"/>
+            </wp:cNvGraphicFramePr>
+            <a:graphic xmlns:a="http://schemas.openxmlformats.org/drawingml/2006/main">
+              <a:graphicData uri="http://schemas.openxmlformats.org/drawingml/2006/picture">
+                <pic:pic xmlns:pic="http://schemas.openxmlformats.org/drawingml/2006/picture">
+                  <pic:nvPicPr>
+                    <pic:cNvPr id="0" name="" descr=""/>
+                    <pic:cNvPicPr>
+                      <a:picLocks noChangeAspect="1" noChangeArrowheads="1"/>
+                    </pic:cNvPicPr>
+                  </pic:nvPicPr>
+                  <pic:blipFill>
+                    <a:blip r:embed="rId16" cstate="none"/>
+                    <a:srcRect/>
+                    <a:stretch>
+                      <a:fillRect/>
+                    </a:stretch>
+                  </pic:blipFill>
+                  <pic:spPr bwMode="auto">
+                    <a:xfrm>
+                      <a:off x="0" y="0"/>
                       <a:ext cx="5715000" cy="2247900"/>
                     </a:xfrm>
                     <a:prstGeom prst="rect">
@@ -4166,7 +4629,7 @@
                     </pic:cNvPicPr>
                   </pic:nvPicPr>
                   <pic:blipFill>
-                    <a:blip r:embed="rId16" cstate="none"/>
+                    <a:blip r:embed="rId17" cstate="none"/>
                     <a:srcRect/>
                     <a:stretch>
                       <a:fillRect/>

</xml_diff>

<commit_message>
Chapitre V : logos des outils, langages et frameworks à côté de leur description
</commit_message>
<xml_diff>
--- a/docs/Chapitre_V_Architecture_et_choix_technologiques.docx
+++ b/docs/Chapitre_V_Architecture_et_choix_technologiques.docx
@@ -3900,15 +3900,117 @@
         <w:t xml:space="preserve">2.1. Visual Studio Code [Éditeur de code]</w:t>
       </w:r>
     </w:p>
-    <w:p>
-      <w:pPr>
-        <w:spacing w:after="140" w:line="300"/>
-        <w:jc w:val="both"/>
-      </w:pPr>
-      <w:r>
-        <w:t xml:space="preserve">Plus connu sous le nom de VS Code, Visual Studio Code est un éditeur de code source développé par Microsoft pour les systèmes d'exploitation Windows, Linux et macOS. Il permet de développer dans de nombreux langages de programmation, tels que HTML, CSS, JavaScript, PHP et bien d'autres. Doté de nombreuses fonctionnalités avancées, il facilite la programmation en offrant des outils tels que la complétion intelligente du code, la mise en évidence de la syntaxe, la recherche dans tout le projet, l'intégration de Git et un terminal intégré. Il a été l'éditeur avec lequel l'ensemble du code de la plateforme a été écrit et relu.</w:t>
-      </w:r>
-    </w:p>
+    <w:tbl>
+      <w:tblPr>
+        <w:tblW w:type="dxa" w:w="9072"/>
+        <w:tblBorders>
+          <w:top w:val="none" w:color="FFFFFF" w:sz="0"/>
+          <w:left w:val="none" w:color="FFFFFF" w:sz="0"/>
+          <w:bottom w:val="none" w:color="FFFFFF" w:sz="0"/>
+          <w:right w:val="none" w:color="FFFFFF" w:sz="0"/>
+          <w:insideH w:val="none" w:color="FFFFFF" w:sz="0"/>
+          <w:insideV w:val="none" w:color="FFFFFF" w:sz="0"/>
+        </w:tblBorders>
+      </w:tblPr>
+      <w:tblGrid>
+        <w:gridCol w:w="1500"/>
+        <w:gridCol w:w="7572"/>
+      </w:tblGrid>
+      <w:tr>
+        <w:trPr>
+          <w:cantSplit/>
+        </w:trPr>
+        <w:tc>
+          <w:tcPr>
+            <w:tcW w:type="dxa" w:w="1500"/>
+            <w:tcBorders>
+              <w:top w:val="none" w:color="FFFFFF" w:sz="0"/>
+              <w:left w:val="none" w:color="FFFFFF" w:sz="0"/>
+              <w:bottom w:val="none" w:color="FFFFFF" w:sz="0"/>
+              <w:right w:val="none" w:color="FFFFFF" w:sz="0"/>
+            </w:tcBorders>
+            <w:tcMar>
+              <w:top w:type="dxa" w:w="40"/>
+              <w:left w:type="dxa" w:w="40"/>
+              <w:bottom w:type="dxa" w:w="40"/>
+              <w:right w:type="dxa" w:w="100"/>
+            </w:tcMar>
+          </w:tcPr>
+          <w:p>
+            <w:pPr>
+              <w:spacing w:after="60" w:before="40"/>
+              <w:jc w:val="center"/>
+            </w:pPr>
+            <w:r>
+              <w:drawing>
+                <wp:inline distT="0" distB="0" distL="0" distR="0">
+                  <wp:extent cx="628650" cy="628650"/>
+                  <wp:effectExtent t="0" r="0" b="0" l="0"/>
+                  <wp:docPr id="1" name="vscode" descr="Logo vscode" title="vscode"/>
+                  <wp:cNvGraphicFramePr>
+                    <a:graphicFrameLocks xmlns:a="http://schemas.openxmlformats.org/drawingml/2006/main" noChangeAspect="1"/>
+                  </wp:cNvGraphicFramePr>
+                  <a:graphic xmlns:a="http://schemas.openxmlformats.org/drawingml/2006/main">
+                    <a:graphicData uri="http://schemas.openxmlformats.org/drawingml/2006/picture">
+                      <pic:pic xmlns:pic="http://schemas.openxmlformats.org/drawingml/2006/picture">
+                        <pic:nvPicPr>
+                          <pic:cNvPr id="0" name="" descr=""/>
+                          <pic:cNvPicPr>
+                            <a:picLocks noChangeAspect="1" noChangeArrowheads="1"/>
+                          </pic:cNvPicPr>
+                        </pic:nvPicPr>
+                        <pic:blipFill>
+                          <a:blip r:embed="rId13" cstate="none"/>
+                          <a:srcRect/>
+                          <a:stretch>
+                            <a:fillRect/>
+                          </a:stretch>
+                        </pic:blipFill>
+                        <pic:spPr bwMode="auto">
+                          <a:xfrm>
+                            <a:off x="0" y="0"/>
+                            <a:ext cx="628650" cy="628650"/>
+                          </a:xfrm>
+                          <a:prstGeom prst="rect">
+                            <a:avLst/>
+                          </a:prstGeom>
+                        </pic:spPr>
+                      </pic:pic>
+                    </a:graphicData>
+                  </a:graphic>
+                </wp:inline>
+              </w:drawing>
+            </w:r>
+          </w:p>
+        </w:tc>
+        <w:tc>
+          <w:tcPr>
+            <w:tcW w:type="dxa" w:w="7572"/>
+            <w:tcBorders>
+              <w:top w:val="none" w:color="FFFFFF" w:sz="0"/>
+              <w:left w:val="none" w:color="FFFFFF" w:sz="0"/>
+              <w:bottom w:val="none" w:color="FFFFFF" w:sz="0"/>
+              <w:right w:val="none" w:color="FFFFFF" w:sz="0"/>
+            </w:tcBorders>
+            <w:tcMar>
+              <w:top w:type="dxa" w:w="40"/>
+              <w:left w:type="dxa" w:w="100"/>
+              <w:bottom w:type="dxa" w:w="40"/>
+              <w:right w:type="dxa" w:w="40"/>
+            </w:tcMar>
+          </w:tcPr>
+          <w:p>
+            <w:pPr>
+              <w:spacing w:after="140" w:line="300"/>
+              <w:jc w:val="both"/>
+            </w:pPr>
+            <w:r>
+              <w:t xml:space="preserve">Plus connu sous le nom de VS Code, Visual Studio Code est un éditeur de code source développé par Microsoft pour les systèmes d'exploitation Windows, Linux et macOS. Il permet de développer dans de nombreux langages de programmation, tels que HTML, CSS, JavaScript, PHP et bien d'autres. Doté de nombreuses fonctionnalités avancées, il facilite la programmation en offrant des outils tels que la complétion intelligente du code, la mise en évidence de la syntaxe, la recherche dans tout le projet, l'intégration de Git et un terminal intégré. Il a été l'éditeur avec lequel l'ensemble du code de la plateforme a été écrit et relu.</w:t>
+            </w:r>
+          </w:p>
+        </w:tc>
+      </w:tr>
+    </w:tbl>
     <w:p>
       <w:pPr>
         <w:pStyle w:val="Heading3"/>
@@ -3926,24 +4028,228 @@
         <w:t xml:space="preserve">2.2. MariaDB et phpMyAdmin [Système de gestion de base de données]</w:t>
       </w:r>
     </w:p>
-    <w:p>
-      <w:pPr>
-        <w:spacing w:after="140" w:line="300"/>
-        <w:jc w:val="both"/>
-      </w:pPr>
-      <w:r>
-        <w:t xml:space="preserve">MariaDB est un système de gestion de bases de données relationnelles libre et gratuit. Il a été créé en 2009 par Michael Widenius, l'un des concepteurs de MySQL, à partir du code de ce dernier, et il en reste compatible : les mêmes requêtes SQL et les mêmes outils fonctionnent avec les deux. Il est réputé pour sa fiabilité, ses performances et sa facilité d'utilisation. Son moteur InnoDB gère les transactions et l'intégrité des données, ce qui est indispensable pour des dossiers officiels dont l'historique doit rester fiable. Dans notre cas, nous avons choisi MariaDB pour le développement de notre application en raison de sa robustesse, de sa gratuité et de sa compatibilité avec Laravel.</w:t>
-      </w:r>
-    </w:p>
-    <w:p>
-      <w:pPr>
-        <w:spacing w:after="140" w:line="300"/>
-        <w:jc w:val="both"/>
-      </w:pPr>
-      <w:r>
-        <w:t xml:space="preserve">phpMyAdmin est une interface web, écrite en PHP, qui permet d'administrer une base de données MySQL ou MariaDB sans écrire de commandes : consultation des tables, exécution de requêtes, import et export de la base. Elle a servi à vérifier les données pendant le développement et à produire l'export SQL du projet. Nous utilisons MariaDB 13.0.2 et phpMyAdmin 5.2.3.</w:t>
-      </w:r>
-    </w:p>
+    <w:tbl>
+      <w:tblPr>
+        <w:tblW w:type="dxa" w:w="9072"/>
+        <w:tblBorders>
+          <w:top w:val="none" w:color="FFFFFF" w:sz="0"/>
+          <w:left w:val="none" w:color="FFFFFF" w:sz="0"/>
+          <w:bottom w:val="none" w:color="FFFFFF" w:sz="0"/>
+          <w:right w:val="none" w:color="FFFFFF" w:sz="0"/>
+          <w:insideH w:val="none" w:color="FFFFFF" w:sz="0"/>
+          <w:insideV w:val="none" w:color="FFFFFF" w:sz="0"/>
+        </w:tblBorders>
+      </w:tblPr>
+      <w:tblGrid>
+        <w:gridCol w:w="1500"/>
+        <w:gridCol w:w="7572"/>
+      </w:tblGrid>
+      <w:tr>
+        <w:trPr>
+          <w:cantSplit/>
+        </w:trPr>
+        <w:tc>
+          <w:tcPr>
+            <w:tcW w:type="dxa" w:w="1500"/>
+            <w:tcBorders>
+              <w:top w:val="none" w:color="FFFFFF" w:sz="0"/>
+              <w:left w:val="none" w:color="FFFFFF" w:sz="0"/>
+              <w:bottom w:val="none" w:color="FFFFFF" w:sz="0"/>
+              <w:right w:val="none" w:color="FFFFFF" w:sz="0"/>
+            </w:tcBorders>
+            <w:tcMar>
+              <w:top w:type="dxa" w:w="40"/>
+              <w:left w:type="dxa" w:w="40"/>
+              <w:bottom w:type="dxa" w:w="40"/>
+              <w:right w:type="dxa" w:w="100"/>
+            </w:tcMar>
+          </w:tcPr>
+          <w:p>
+            <w:pPr>
+              <w:spacing w:after="60" w:before="40"/>
+              <w:jc w:val="center"/>
+            </w:pPr>
+            <w:r>
+              <w:drawing>
+                <wp:inline distT="0" distB="0" distL="0" distR="0">
+                  <wp:extent cx="628650" cy="628650"/>
+                  <wp:effectExtent t="0" r="0" b="0" l="0"/>
+                  <wp:docPr id="1" name="mariadb" descr="Logo mariadb" title="mariadb"/>
+                  <wp:cNvGraphicFramePr>
+                    <a:graphicFrameLocks xmlns:a="http://schemas.openxmlformats.org/drawingml/2006/main" noChangeAspect="1"/>
+                  </wp:cNvGraphicFramePr>
+                  <a:graphic xmlns:a="http://schemas.openxmlformats.org/drawingml/2006/main">
+                    <a:graphicData uri="http://schemas.openxmlformats.org/drawingml/2006/picture">
+                      <pic:pic xmlns:pic="http://schemas.openxmlformats.org/drawingml/2006/picture">
+                        <pic:nvPicPr>
+                          <pic:cNvPr id="0" name="" descr=""/>
+                          <pic:cNvPicPr>
+                            <a:picLocks noChangeAspect="1" noChangeArrowheads="1"/>
+                          </pic:cNvPicPr>
+                        </pic:nvPicPr>
+                        <pic:blipFill>
+                          <a:blip r:embed="rId14" cstate="none"/>
+                          <a:srcRect/>
+                          <a:stretch>
+                            <a:fillRect/>
+                          </a:stretch>
+                        </pic:blipFill>
+                        <pic:spPr bwMode="auto">
+                          <a:xfrm>
+                            <a:off x="0" y="0"/>
+                            <a:ext cx="628650" cy="628650"/>
+                          </a:xfrm>
+                          <a:prstGeom prst="rect">
+                            <a:avLst/>
+                          </a:prstGeom>
+                        </pic:spPr>
+                      </pic:pic>
+                    </a:graphicData>
+                  </a:graphic>
+                </wp:inline>
+              </w:drawing>
+            </w:r>
+          </w:p>
+        </w:tc>
+        <w:tc>
+          <w:tcPr>
+            <w:tcW w:type="dxa" w:w="7572"/>
+            <w:tcBorders>
+              <w:top w:val="none" w:color="FFFFFF" w:sz="0"/>
+              <w:left w:val="none" w:color="FFFFFF" w:sz="0"/>
+              <w:bottom w:val="none" w:color="FFFFFF" w:sz="0"/>
+              <w:right w:val="none" w:color="FFFFFF" w:sz="0"/>
+            </w:tcBorders>
+            <w:tcMar>
+              <w:top w:type="dxa" w:w="40"/>
+              <w:left w:type="dxa" w:w="100"/>
+              <w:bottom w:type="dxa" w:w="40"/>
+              <w:right w:type="dxa" w:w="40"/>
+            </w:tcMar>
+          </w:tcPr>
+          <w:p>
+            <w:pPr>
+              <w:spacing w:after="140" w:line="300"/>
+              <w:jc w:val="both"/>
+            </w:pPr>
+            <w:r>
+              <w:t xml:space="preserve">MariaDB est un système de gestion de bases de données relationnelles libre et gratuit. Il a été créé en 2009 par Michael Widenius, l'un des concepteurs de MySQL, à partir du code de ce dernier, et il en reste compatible : les mêmes requêtes SQL et les mêmes outils fonctionnent avec les deux. Il est réputé pour sa fiabilité, ses performances et sa facilité d'utilisation. Son moteur InnoDB gère les transactions et l'intégrité des données, ce qui est indispensable pour des dossiers officiels dont l'historique doit rester fiable. Dans notre cas, nous avons choisi MariaDB pour le développement de notre application en raison de sa robustesse, de sa gratuité et de sa compatibilité avec Laravel.</w:t>
+            </w:r>
+          </w:p>
+        </w:tc>
+      </w:tr>
+    </w:tbl>
+    <w:tbl>
+      <w:tblPr>
+        <w:tblW w:type="dxa" w:w="9072"/>
+        <w:tblBorders>
+          <w:top w:val="none" w:color="FFFFFF" w:sz="0"/>
+          <w:left w:val="none" w:color="FFFFFF" w:sz="0"/>
+          <w:bottom w:val="none" w:color="FFFFFF" w:sz="0"/>
+          <w:right w:val="none" w:color="FFFFFF" w:sz="0"/>
+          <w:insideH w:val="none" w:color="FFFFFF" w:sz="0"/>
+          <w:insideV w:val="none" w:color="FFFFFF" w:sz="0"/>
+        </w:tblBorders>
+      </w:tblPr>
+      <w:tblGrid>
+        <w:gridCol w:w="1500"/>
+        <w:gridCol w:w="7572"/>
+      </w:tblGrid>
+      <w:tr>
+        <w:trPr>
+          <w:cantSplit/>
+        </w:trPr>
+        <w:tc>
+          <w:tcPr>
+            <w:tcW w:type="dxa" w:w="1500"/>
+            <w:tcBorders>
+              <w:top w:val="none" w:color="FFFFFF" w:sz="0"/>
+              <w:left w:val="none" w:color="FFFFFF" w:sz="0"/>
+              <w:bottom w:val="none" w:color="FFFFFF" w:sz="0"/>
+              <w:right w:val="none" w:color="FFFFFF" w:sz="0"/>
+            </w:tcBorders>
+            <w:tcMar>
+              <w:top w:type="dxa" w:w="40"/>
+              <w:left w:type="dxa" w:w="40"/>
+              <w:bottom w:type="dxa" w:w="40"/>
+              <w:right w:type="dxa" w:w="100"/>
+            </w:tcMar>
+          </w:tcPr>
+          <w:p>
+            <w:pPr>
+              <w:spacing w:after="60" w:before="40"/>
+              <w:jc w:val="center"/>
+            </w:pPr>
+            <w:r>
+              <w:drawing>
+                <wp:inline distT="0" distB="0" distL="0" distR="0">
+                  <wp:extent cx="628650" cy="628650"/>
+                  <wp:effectExtent t="0" r="0" b="0" l="0"/>
+                  <wp:docPr id="1" name="phpmyadmin" descr="Logo phpmyadmin" title="phpmyadmin"/>
+                  <wp:cNvGraphicFramePr>
+                    <a:graphicFrameLocks xmlns:a="http://schemas.openxmlformats.org/drawingml/2006/main" noChangeAspect="1"/>
+                  </wp:cNvGraphicFramePr>
+                  <a:graphic xmlns:a="http://schemas.openxmlformats.org/drawingml/2006/main">
+                    <a:graphicData uri="http://schemas.openxmlformats.org/drawingml/2006/picture">
+                      <pic:pic xmlns:pic="http://schemas.openxmlformats.org/drawingml/2006/picture">
+                        <pic:nvPicPr>
+                          <pic:cNvPr id="0" name="" descr=""/>
+                          <pic:cNvPicPr>
+                            <a:picLocks noChangeAspect="1" noChangeArrowheads="1"/>
+                          </pic:cNvPicPr>
+                        </pic:nvPicPr>
+                        <pic:blipFill>
+                          <a:blip r:embed="rId15" cstate="none"/>
+                          <a:srcRect/>
+                          <a:stretch>
+                            <a:fillRect/>
+                          </a:stretch>
+                        </pic:blipFill>
+                        <pic:spPr bwMode="auto">
+                          <a:xfrm>
+                            <a:off x="0" y="0"/>
+                            <a:ext cx="628650" cy="628650"/>
+                          </a:xfrm>
+                          <a:prstGeom prst="rect">
+                            <a:avLst/>
+                          </a:prstGeom>
+                        </pic:spPr>
+                      </pic:pic>
+                    </a:graphicData>
+                  </a:graphic>
+                </wp:inline>
+              </w:drawing>
+            </w:r>
+          </w:p>
+        </w:tc>
+        <w:tc>
+          <w:tcPr>
+            <w:tcW w:type="dxa" w:w="7572"/>
+            <w:tcBorders>
+              <w:top w:val="none" w:color="FFFFFF" w:sz="0"/>
+              <w:left w:val="none" w:color="FFFFFF" w:sz="0"/>
+              <w:bottom w:val="none" w:color="FFFFFF" w:sz="0"/>
+              <w:right w:val="none" w:color="FFFFFF" w:sz="0"/>
+            </w:tcBorders>
+            <w:tcMar>
+              <w:top w:type="dxa" w:w="40"/>
+              <w:left w:type="dxa" w:w="100"/>
+              <w:bottom w:type="dxa" w:w="40"/>
+              <w:right w:type="dxa" w:w="40"/>
+            </w:tcMar>
+          </w:tcPr>
+          <w:p>
+            <w:pPr>
+              <w:spacing w:after="140" w:line="300"/>
+              <w:jc w:val="both"/>
+            </w:pPr>
+            <w:r>
+              <w:t xml:space="preserve">phpMyAdmin est une interface web, écrite en PHP, qui permet d'administrer une base de données MySQL ou MariaDB sans écrire de commandes : consultation des tables, exécution de requêtes, import et export de la base. Elle a servi à vérifier les données pendant le développement et à produire l'export SQL du projet. Nous utilisons MariaDB 13.0.2 et phpMyAdmin 5.2.3.</w:t>
+            </w:r>
+          </w:p>
+        </w:tc>
+      </w:tr>
+    </w:tbl>
     <w:p>
       <w:pPr>
         <w:pStyle w:val="Heading3"/>
@@ -3961,15 +4267,163 @@
         <w:t xml:space="preserve">2.3. Git et GitHub [Gestion des versions]</w:t>
       </w:r>
     </w:p>
-    <w:p>
-      <w:pPr>
-        <w:spacing w:after="140" w:line="300"/>
-        <w:jc w:val="both"/>
-      </w:pPr>
-      <w:r>
-        <w:t xml:space="preserve">Git est un logiciel de gestion de versions créé en 2005 par Linus Torvalds, le concepteur du noyau Linux. Il enregistre l'historique de toutes les modifications du code et permet de revenir à une version antérieure en cas de problème. GitHub est un service en ligne qui héberge des dépôts Git ; il a été lancé en 2008 et appartient à Microsoft depuis 2018. Nous avons créé un commit pour chaque fonctionnalité de la plateforme et nous avons sauvegardé le dépôt sur GitHub, ce qui protège le projet et conserve tout son historique.</w:t>
-      </w:r>
-    </w:p>
+    <w:tbl>
+      <w:tblPr>
+        <w:tblW w:type="dxa" w:w="9072"/>
+        <w:tblBorders>
+          <w:top w:val="none" w:color="FFFFFF" w:sz="0"/>
+          <w:left w:val="none" w:color="FFFFFF" w:sz="0"/>
+          <w:bottom w:val="none" w:color="FFFFFF" w:sz="0"/>
+          <w:right w:val="none" w:color="FFFFFF" w:sz="0"/>
+          <w:insideH w:val="none" w:color="FFFFFF" w:sz="0"/>
+          <w:insideV w:val="none" w:color="FFFFFF" w:sz="0"/>
+        </w:tblBorders>
+      </w:tblPr>
+      <w:tblGrid>
+        <w:gridCol w:w="1500"/>
+        <w:gridCol w:w="7572"/>
+      </w:tblGrid>
+      <w:tr>
+        <w:trPr>
+          <w:cantSplit/>
+        </w:trPr>
+        <w:tc>
+          <w:tcPr>
+            <w:tcW w:type="dxa" w:w="1500"/>
+            <w:tcBorders>
+              <w:top w:val="none" w:color="FFFFFF" w:sz="0"/>
+              <w:left w:val="none" w:color="FFFFFF" w:sz="0"/>
+              <w:bottom w:val="none" w:color="FFFFFF" w:sz="0"/>
+              <w:right w:val="none" w:color="FFFFFF" w:sz="0"/>
+            </w:tcBorders>
+            <w:tcMar>
+              <w:top w:type="dxa" w:w="40"/>
+              <w:left w:type="dxa" w:w="40"/>
+              <w:bottom w:type="dxa" w:w="40"/>
+              <w:right w:type="dxa" w:w="100"/>
+            </w:tcMar>
+          </w:tcPr>
+          <w:p>
+            <w:pPr>
+              <w:spacing w:after="60" w:before="40"/>
+              <w:jc w:val="center"/>
+            </w:pPr>
+            <w:r>
+              <w:drawing>
+                <wp:inline distT="0" distB="0" distL="0" distR="0">
+                  <wp:extent cx="495300" cy="495300"/>
+                  <wp:effectExtent t="0" r="0" b="0" l="0"/>
+                  <wp:docPr id="1" name="git" descr="Logo git" title="git"/>
+                  <wp:cNvGraphicFramePr>
+                    <a:graphicFrameLocks xmlns:a="http://schemas.openxmlformats.org/drawingml/2006/main" noChangeAspect="1"/>
+                  </wp:cNvGraphicFramePr>
+                  <a:graphic xmlns:a="http://schemas.openxmlformats.org/drawingml/2006/main">
+                    <a:graphicData uri="http://schemas.openxmlformats.org/drawingml/2006/picture">
+                      <pic:pic xmlns:pic="http://schemas.openxmlformats.org/drawingml/2006/picture">
+                        <pic:nvPicPr>
+                          <pic:cNvPr id="0" name="" descr=""/>
+                          <pic:cNvPicPr>
+                            <a:picLocks noChangeAspect="1" noChangeArrowheads="1"/>
+                          </pic:cNvPicPr>
+                        </pic:nvPicPr>
+                        <pic:blipFill>
+                          <a:blip r:embed="rId16" cstate="none"/>
+                          <a:srcRect/>
+                          <a:stretch>
+                            <a:fillRect/>
+                          </a:stretch>
+                        </pic:blipFill>
+                        <pic:spPr bwMode="auto">
+                          <a:xfrm>
+                            <a:off x="0" y="0"/>
+                            <a:ext cx="495300" cy="495300"/>
+                          </a:xfrm>
+                          <a:prstGeom prst="rect">
+                            <a:avLst/>
+                          </a:prstGeom>
+                        </pic:spPr>
+                      </pic:pic>
+                    </a:graphicData>
+                  </a:graphic>
+                </wp:inline>
+              </w:drawing>
+            </w:r>
+          </w:p>
+          <w:p>
+            <w:pPr>
+              <w:spacing w:after="60" w:before="40"/>
+              <w:jc w:val="center"/>
+            </w:pPr>
+            <w:r>
+              <w:drawing>
+                <wp:inline distT="0" distB="0" distL="0" distR="0">
+                  <wp:extent cx="495300" cy="495300"/>
+                  <wp:effectExtent t="0" r="0" b="0" l="0"/>
+                  <wp:docPr id="1" name="github" descr="Logo github" title="github"/>
+                  <wp:cNvGraphicFramePr>
+                    <a:graphicFrameLocks xmlns:a="http://schemas.openxmlformats.org/drawingml/2006/main" noChangeAspect="1"/>
+                  </wp:cNvGraphicFramePr>
+                  <a:graphic xmlns:a="http://schemas.openxmlformats.org/drawingml/2006/main">
+                    <a:graphicData uri="http://schemas.openxmlformats.org/drawingml/2006/picture">
+                      <pic:pic xmlns:pic="http://schemas.openxmlformats.org/drawingml/2006/picture">
+                        <pic:nvPicPr>
+                          <pic:cNvPr id="0" name="" descr=""/>
+                          <pic:cNvPicPr>
+                            <a:picLocks noChangeAspect="1" noChangeArrowheads="1"/>
+                          </pic:cNvPicPr>
+                        </pic:nvPicPr>
+                        <pic:blipFill>
+                          <a:blip r:embed="rId17" cstate="none"/>
+                          <a:srcRect/>
+                          <a:stretch>
+                            <a:fillRect/>
+                          </a:stretch>
+                        </pic:blipFill>
+                        <pic:spPr bwMode="auto">
+                          <a:xfrm>
+                            <a:off x="0" y="0"/>
+                            <a:ext cx="495300" cy="495300"/>
+                          </a:xfrm>
+                          <a:prstGeom prst="rect">
+                            <a:avLst/>
+                          </a:prstGeom>
+                        </pic:spPr>
+                      </pic:pic>
+                    </a:graphicData>
+                  </a:graphic>
+                </wp:inline>
+              </w:drawing>
+            </w:r>
+          </w:p>
+        </w:tc>
+        <w:tc>
+          <w:tcPr>
+            <w:tcW w:type="dxa" w:w="7572"/>
+            <w:tcBorders>
+              <w:top w:val="none" w:color="FFFFFF" w:sz="0"/>
+              <w:left w:val="none" w:color="FFFFFF" w:sz="0"/>
+              <w:bottom w:val="none" w:color="FFFFFF" w:sz="0"/>
+              <w:right w:val="none" w:color="FFFFFF" w:sz="0"/>
+            </w:tcBorders>
+            <w:tcMar>
+              <w:top w:type="dxa" w:w="40"/>
+              <w:left w:type="dxa" w:w="100"/>
+              <w:bottom w:type="dxa" w:w="40"/>
+              <w:right w:type="dxa" w:w="40"/>
+            </w:tcMar>
+          </w:tcPr>
+          <w:p>
+            <w:pPr>
+              <w:spacing w:after="140" w:line="300"/>
+              <w:jc w:val="both"/>
+            </w:pPr>
+            <w:r>
+              <w:t xml:space="preserve">Git est un logiciel de gestion de versions créé en 2005 par Linus Torvalds, le concepteur du noyau Linux. Il enregistre l'historique de toutes les modifications du code et permet de revenir à une version antérieure en cas de problème. GitHub est un service en ligne qui héberge des dépôts Git ; il a été lancé en 2008 et appartient à Microsoft depuis 2018. Nous avons créé un commit pour chaque fonctionnalité de la plateforme et nous avons sauvegardé le dépôt sur GitHub, ce qui protège le projet et conserve tout son historique.</w:t>
+            </w:r>
+          </w:p>
+        </w:tc>
+      </w:tr>
+    </w:tbl>
     <w:p>
       <w:pPr>
         <w:pStyle w:val="Heading3"/>
@@ -3987,15 +4441,163 @@
         <w:t xml:space="preserve">2.4. Composer et Homebrew [Gestionnaires de paquets]</w:t>
       </w:r>
     </w:p>
-    <w:p>
-      <w:pPr>
-        <w:spacing w:after="140" w:line="300"/>
-        <w:jc w:val="both"/>
-      </w:pPr>
-      <w:r>
-        <w:t xml:space="preserve">Composer est le gestionnaire de dépendances de PHP. Il installe et met à jour les bibliothèques dont un projet a besoin, comme Laravel, à partir d'un simple fichier de description. Homebrew est le gestionnaire de paquets de macOS : il nous a permis d'installer PHP, MariaDB, phpMyAdmin, Node.js et Git avec une seule commande chacun, et de reproduire facilement le même environnement sur une autre machine.</w:t>
-      </w:r>
-    </w:p>
+    <w:tbl>
+      <w:tblPr>
+        <w:tblW w:type="dxa" w:w="9072"/>
+        <w:tblBorders>
+          <w:top w:val="none" w:color="FFFFFF" w:sz="0"/>
+          <w:left w:val="none" w:color="FFFFFF" w:sz="0"/>
+          <w:bottom w:val="none" w:color="FFFFFF" w:sz="0"/>
+          <w:right w:val="none" w:color="FFFFFF" w:sz="0"/>
+          <w:insideH w:val="none" w:color="FFFFFF" w:sz="0"/>
+          <w:insideV w:val="none" w:color="FFFFFF" w:sz="0"/>
+        </w:tblBorders>
+      </w:tblPr>
+      <w:tblGrid>
+        <w:gridCol w:w="1500"/>
+        <w:gridCol w:w="7572"/>
+      </w:tblGrid>
+      <w:tr>
+        <w:trPr>
+          <w:cantSplit/>
+        </w:trPr>
+        <w:tc>
+          <w:tcPr>
+            <w:tcW w:type="dxa" w:w="1500"/>
+            <w:tcBorders>
+              <w:top w:val="none" w:color="FFFFFF" w:sz="0"/>
+              <w:left w:val="none" w:color="FFFFFF" w:sz="0"/>
+              <w:bottom w:val="none" w:color="FFFFFF" w:sz="0"/>
+              <w:right w:val="none" w:color="FFFFFF" w:sz="0"/>
+            </w:tcBorders>
+            <w:tcMar>
+              <w:top w:type="dxa" w:w="40"/>
+              <w:left w:type="dxa" w:w="40"/>
+              <w:bottom w:type="dxa" w:w="40"/>
+              <w:right w:type="dxa" w:w="100"/>
+            </w:tcMar>
+          </w:tcPr>
+          <w:p>
+            <w:pPr>
+              <w:spacing w:after="60" w:before="40"/>
+              <w:jc w:val="center"/>
+            </w:pPr>
+            <w:r>
+              <w:drawing>
+                <wp:inline distT="0" distB="0" distL="0" distR="0">
+                  <wp:extent cx="495300" cy="495300"/>
+                  <wp:effectExtent t="0" r="0" b="0" l="0"/>
+                  <wp:docPr id="1" name="composer" descr="Logo composer" title="composer"/>
+                  <wp:cNvGraphicFramePr>
+                    <a:graphicFrameLocks xmlns:a="http://schemas.openxmlformats.org/drawingml/2006/main" noChangeAspect="1"/>
+                  </wp:cNvGraphicFramePr>
+                  <a:graphic xmlns:a="http://schemas.openxmlformats.org/drawingml/2006/main">
+                    <a:graphicData uri="http://schemas.openxmlformats.org/drawingml/2006/picture">
+                      <pic:pic xmlns:pic="http://schemas.openxmlformats.org/drawingml/2006/picture">
+                        <pic:nvPicPr>
+                          <pic:cNvPr id="0" name="" descr=""/>
+                          <pic:cNvPicPr>
+                            <a:picLocks noChangeAspect="1" noChangeArrowheads="1"/>
+                          </pic:cNvPicPr>
+                        </pic:nvPicPr>
+                        <pic:blipFill>
+                          <a:blip r:embed="rId18" cstate="none"/>
+                          <a:srcRect/>
+                          <a:stretch>
+                            <a:fillRect/>
+                          </a:stretch>
+                        </pic:blipFill>
+                        <pic:spPr bwMode="auto">
+                          <a:xfrm>
+                            <a:off x="0" y="0"/>
+                            <a:ext cx="495300" cy="495300"/>
+                          </a:xfrm>
+                          <a:prstGeom prst="rect">
+                            <a:avLst/>
+                          </a:prstGeom>
+                        </pic:spPr>
+                      </pic:pic>
+                    </a:graphicData>
+                  </a:graphic>
+                </wp:inline>
+              </w:drawing>
+            </w:r>
+          </w:p>
+          <w:p>
+            <w:pPr>
+              <w:spacing w:after="60" w:before="40"/>
+              <w:jc w:val="center"/>
+            </w:pPr>
+            <w:r>
+              <w:drawing>
+                <wp:inline distT="0" distB="0" distL="0" distR="0">
+                  <wp:extent cx="495300" cy="495300"/>
+                  <wp:effectExtent t="0" r="0" b="0" l="0"/>
+                  <wp:docPr id="1" name="homebrew" descr="Logo homebrew" title="homebrew"/>
+                  <wp:cNvGraphicFramePr>
+                    <a:graphicFrameLocks xmlns:a="http://schemas.openxmlformats.org/drawingml/2006/main" noChangeAspect="1"/>
+                  </wp:cNvGraphicFramePr>
+                  <a:graphic xmlns:a="http://schemas.openxmlformats.org/drawingml/2006/main">
+                    <a:graphicData uri="http://schemas.openxmlformats.org/drawingml/2006/picture">
+                      <pic:pic xmlns:pic="http://schemas.openxmlformats.org/drawingml/2006/picture">
+                        <pic:nvPicPr>
+                          <pic:cNvPr id="0" name="" descr=""/>
+                          <pic:cNvPicPr>
+                            <a:picLocks noChangeAspect="1" noChangeArrowheads="1"/>
+                          </pic:cNvPicPr>
+                        </pic:nvPicPr>
+                        <pic:blipFill>
+                          <a:blip r:embed="rId19" cstate="none"/>
+                          <a:srcRect/>
+                          <a:stretch>
+                            <a:fillRect/>
+                          </a:stretch>
+                        </pic:blipFill>
+                        <pic:spPr bwMode="auto">
+                          <a:xfrm>
+                            <a:off x="0" y="0"/>
+                            <a:ext cx="495300" cy="495300"/>
+                          </a:xfrm>
+                          <a:prstGeom prst="rect">
+                            <a:avLst/>
+                          </a:prstGeom>
+                        </pic:spPr>
+                      </pic:pic>
+                    </a:graphicData>
+                  </a:graphic>
+                </wp:inline>
+              </w:drawing>
+            </w:r>
+          </w:p>
+        </w:tc>
+        <w:tc>
+          <w:tcPr>
+            <w:tcW w:type="dxa" w:w="7572"/>
+            <w:tcBorders>
+              <w:top w:val="none" w:color="FFFFFF" w:sz="0"/>
+              <w:left w:val="none" w:color="FFFFFF" w:sz="0"/>
+              <w:bottom w:val="none" w:color="FFFFFF" w:sz="0"/>
+              <w:right w:val="none" w:color="FFFFFF" w:sz="0"/>
+            </w:tcBorders>
+            <w:tcMar>
+              <w:top w:type="dxa" w:w="40"/>
+              <w:left w:type="dxa" w:w="100"/>
+              <w:bottom w:type="dxa" w:w="40"/>
+              <w:right w:type="dxa" w:w="40"/>
+            </w:tcMar>
+          </w:tcPr>
+          <w:p>
+            <w:pPr>
+              <w:spacing w:after="140" w:line="300"/>
+              <w:jc w:val="both"/>
+            </w:pPr>
+            <w:r>
+              <w:t xml:space="preserve">Composer est le gestionnaire de dépendances de PHP. Il installe et met à jour les bibliothèques dont un projet a besoin, comme Laravel, à partir d'un simple fichier de description. Homebrew est le gestionnaire de paquets de macOS : il nous a permis d'installer PHP, MariaDB, phpMyAdmin, Node.js et Git avec une seule commande chacun, et de reproduire facilement le même environnement sur une autre machine.</w:t>
+            </w:r>
+          </w:p>
+        </w:tc>
+      </w:tr>
+    </w:tbl>
     <w:p>
       <w:pPr>
         <w:pStyle w:val="Heading3"/>
@@ -4013,15 +4615,117 @@
         <w:t xml:space="preserve">2.5. Mermaid [Outil de dessin de schémas]</w:t>
       </w:r>
     </w:p>
-    <w:p>
-      <w:pPr>
-        <w:spacing w:after="140" w:line="300"/>
-        <w:jc w:val="both"/>
-      </w:pPr>
-      <w:r>
-        <w:t xml:space="preserve">Mermaid est un outil qui dessine des schémas à partir d'un texte : on décrit les éléments et leurs liens, et un moteur se charge de la mise en page. Il est gratuit et fonctionne dans un navigateur web. Nous l'avons utilisé pour les modèles conceptuels et organisationnels de la méthode Merise (MCD, MCT et MOT). Les schémas du modèle physique des données, eux, sont générés à partir de la structure réelle de la base, ce qui garantit qu'ils correspondent exactement à ce qui est installé.</w:t>
-      </w:r>
-    </w:p>
+    <w:tbl>
+      <w:tblPr>
+        <w:tblW w:type="dxa" w:w="9072"/>
+        <w:tblBorders>
+          <w:top w:val="none" w:color="FFFFFF" w:sz="0"/>
+          <w:left w:val="none" w:color="FFFFFF" w:sz="0"/>
+          <w:bottom w:val="none" w:color="FFFFFF" w:sz="0"/>
+          <w:right w:val="none" w:color="FFFFFF" w:sz="0"/>
+          <w:insideH w:val="none" w:color="FFFFFF" w:sz="0"/>
+          <w:insideV w:val="none" w:color="FFFFFF" w:sz="0"/>
+        </w:tblBorders>
+      </w:tblPr>
+      <w:tblGrid>
+        <w:gridCol w:w="1500"/>
+        <w:gridCol w:w="7572"/>
+      </w:tblGrid>
+      <w:tr>
+        <w:trPr>
+          <w:cantSplit/>
+        </w:trPr>
+        <w:tc>
+          <w:tcPr>
+            <w:tcW w:type="dxa" w:w="1500"/>
+            <w:tcBorders>
+              <w:top w:val="none" w:color="FFFFFF" w:sz="0"/>
+              <w:left w:val="none" w:color="FFFFFF" w:sz="0"/>
+              <w:bottom w:val="none" w:color="FFFFFF" w:sz="0"/>
+              <w:right w:val="none" w:color="FFFFFF" w:sz="0"/>
+            </w:tcBorders>
+            <w:tcMar>
+              <w:top w:type="dxa" w:w="40"/>
+              <w:left w:type="dxa" w:w="40"/>
+              <w:bottom w:type="dxa" w:w="40"/>
+              <w:right w:type="dxa" w:w="100"/>
+            </w:tcMar>
+          </w:tcPr>
+          <w:p>
+            <w:pPr>
+              <w:spacing w:after="60" w:before="40"/>
+              <w:jc w:val="center"/>
+            </w:pPr>
+            <w:r>
+              <w:drawing>
+                <wp:inline distT="0" distB="0" distL="0" distR="0">
+                  <wp:extent cx="628650" cy="628650"/>
+                  <wp:effectExtent t="0" r="0" b="0" l="0"/>
+                  <wp:docPr id="1" name="mermaid" descr="Logo mermaid" title="mermaid"/>
+                  <wp:cNvGraphicFramePr>
+                    <a:graphicFrameLocks xmlns:a="http://schemas.openxmlformats.org/drawingml/2006/main" noChangeAspect="1"/>
+                  </wp:cNvGraphicFramePr>
+                  <a:graphic xmlns:a="http://schemas.openxmlformats.org/drawingml/2006/main">
+                    <a:graphicData uri="http://schemas.openxmlformats.org/drawingml/2006/picture">
+                      <pic:pic xmlns:pic="http://schemas.openxmlformats.org/drawingml/2006/picture">
+                        <pic:nvPicPr>
+                          <pic:cNvPr id="0" name="" descr=""/>
+                          <pic:cNvPicPr>
+                            <a:picLocks noChangeAspect="1" noChangeArrowheads="1"/>
+                          </pic:cNvPicPr>
+                        </pic:nvPicPr>
+                        <pic:blipFill>
+                          <a:blip r:embed="rId20" cstate="none"/>
+                          <a:srcRect/>
+                          <a:stretch>
+                            <a:fillRect/>
+                          </a:stretch>
+                        </pic:blipFill>
+                        <pic:spPr bwMode="auto">
+                          <a:xfrm>
+                            <a:off x="0" y="0"/>
+                            <a:ext cx="628650" cy="628650"/>
+                          </a:xfrm>
+                          <a:prstGeom prst="rect">
+                            <a:avLst/>
+                          </a:prstGeom>
+                        </pic:spPr>
+                      </pic:pic>
+                    </a:graphicData>
+                  </a:graphic>
+                </wp:inline>
+              </w:drawing>
+            </w:r>
+          </w:p>
+        </w:tc>
+        <w:tc>
+          <w:tcPr>
+            <w:tcW w:type="dxa" w:w="7572"/>
+            <w:tcBorders>
+              <w:top w:val="none" w:color="FFFFFF" w:sz="0"/>
+              <w:left w:val="none" w:color="FFFFFF" w:sz="0"/>
+              <w:bottom w:val="none" w:color="FFFFFF" w:sz="0"/>
+              <w:right w:val="none" w:color="FFFFFF" w:sz="0"/>
+            </w:tcBorders>
+            <w:tcMar>
+              <w:top w:type="dxa" w:w="40"/>
+              <w:left w:type="dxa" w:w="100"/>
+              <w:bottom w:type="dxa" w:w="40"/>
+              <w:right w:type="dxa" w:w="40"/>
+            </w:tcMar>
+          </w:tcPr>
+          <w:p>
+            <w:pPr>
+              <w:spacing w:after="140" w:line="300"/>
+              <w:jc w:val="both"/>
+            </w:pPr>
+            <w:r>
+              <w:t xml:space="preserve">Mermaid est un outil qui dessine des schémas à partir d'un texte : on décrit les éléments et leurs liens, et un moteur se charge de la mise en page. Il est gratuit et fonctionne dans un navigateur web. Nous l'avons utilisé pour les modèles conceptuels et organisationnels de la méthode Merise (MCD, MCT et MOT). Les schémas du modèle physique des données, eux, sont générés à partir de la structure réelle de la base, ce qui garantit qu'ils correspondent exactement à ce qui est installé.</w:t>
+            </w:r>
+          </w:p>
+        </w:tc>
+      </w:tr>
+    </w:tbl>
     <w:p>
       <w:pPr>
         <w:pStyle w:val="Heading3"/>
@@ -4039,94 +4743,502 @@
         <w:t xml:space="preserve">2.6. Langages de développement</w:t>
       </w:r>
     </w:p>
-    <w:p>
-      <w:pPr>
-        <w:spacing w:after="140" w:line="300"/>
-        <w:jc w:val="both"/>
-      </w:pPr>
-      <w:r>
-        <w:rPr>
-          <w:b/>
-          <w:bCs/>
-        </w:rPr>
-        <w:t xml:space="preserve">1. HTML</w:t>
-      </w:r>
-    </w:p>
-    <w:p>
-      <w:pPr>
-        <w:spacing w:after="140" w:line="300"/>
-        <w:jc w:val="both"/>
-      </w:pPr>
-      <w:r>
-        <w:t xml:space="preserve">HTML (HyperText Markup Language) est un langage de balisage utilisé pour structurer le contenu des pages web : titres, paragraphes, tableaux, formulaires et images. Il a été inventé au début des années 1990 par Tim Berners-Lee. Chaque écran de la plateforme, du formulaire de connexion aux tableaux de dossiers, est une page HTML.</w:t>
-      </w:r>
-    </w:p>
-    <w:p>
-      <w:pPr>
-        <w:spacing w:after="140" w:line="300"/>
-        <w:jc w:val="both"/>
-      </w:pPr>
-      <w:r>
-        <w:rPr>
-          <w:b/>
-          <w:bCs/>
-        </w:rPr>
-        <w:t xml:space="preserve">2. CSS</w:t>
-      </w:r>
-    </w:p>
-    <w:p>
-      <w:pPr>
-        <w:spacing w:after="140" w:line="300"/>
-        <w:jc w:val="both"/>
-      </w:pPr>
-      <w:r>
-        <w:t xml:space="preserve">CSS (Cascading Style Sheets) est un langage de style pour les pages web. Il contrôle l'apparence des éléments : couleurs, polices, marges et disposition. Il donne à la plateforme un style sobre et cohérent, avec les couleurs du drapeau ivoirien en bandeau et un affichage adapté aux écrans de téléphone comme d'ordinateur.</w:t>
-      </w:r>
-    </w:p>
-    <w:p>
-      <w:pPr>
-        <w:spacing w:after="140" w:line="300"/>
-        <w:jc w:val="both"/>
-      </w:pPr>
-      <w:r>
-        <w:rPr>
-          <w:b/>
-          <w:bCs/>
-        </w:rPr>
-        <w:t xml:space="preserve">3. JavaScript</w:t>
-      </w:r>
-    </w:p>
-    <w:p>
-      <w:pPr>
-        <w:spacing w:after="140" w:line="300"/>
-        <w:jc w:val="both"/>
-      </w:pPr>
-      <w:r>
-        <w:t xml:space="preserve">JavaScript est le langage qui rend les pages web interactives. Il réagit aux actions de l'utilisateur, envoie des requêtes au serveur sans recharger la page et met à jour le contenu affiché. Dans notre application, il affiche les listes de dossiers, envoie les formulaires, gère les notifications et dessine les graphiques du tableau de bord grâce à la bibliothèque Chart.js. Il fonctionne dans tous les navigateurs actuels.</w:t>
-      </w:r>
-    </w:p>
-    <w:p>
-      <w:pPr>
-        <w:spacing w:after="140" w:line="300"/>
-        <w:jc w:val="both"/>
-      </w:pPr>
-      <w:r>
-        <w:rPr>
-          <w:b/>
-          <w:bCs/>
-        </w:rPr>
-        <w:t xml:space="preserve">4. PHP</w:t>
-      </w:r>
-    </w:p>
-    <w:p>
-      <w:pPr>
-        <w:spacing w:after="140" w:line="300"/>
-        <w:jc w:val="both"/>
-      </w:pPr>
-      <w:r>
-        <w:t xml:space="preserve">PHP, qui signifie « PHP: Hypertext Preprocessor », est un langage de programmation web polyvalent et très répandu, créé par Rasmus Lerdorf au milieu des années 1990. Il s'exécute sur le serveur : il reçoit les demandes, applique les règles de l'application, dialogue avec la base de données et renvoie la réponse. Il bénéficie d'une grande communauté de développeurs et il est pris en charge par presque tous les hébergeurs. Nous utilisons la version 8.5, qui permet de typer les données échangées entre les fonctions et évite ainsi de nombreuses erreurs.</w:t>
-      </w:r>
-    </w:p>
+    <w:tbl>
+      <w:tblPr>
+        <w:tblW w:type="dxa" w:w="9072"/>
+        <w:tblBorders>
+          <w:top w:val="none" w:color="FFFFFF" w:sz="0"/>
+          <w:left w:val="none" w:color="FFFFFF" w:sz="0"/>
+          <w:bottom w:val="none" w:color="FFFFFF" w:sz="0"/>
+          <w:right w:val="none" w:color="FFFFFF" w:sz="0"/>
+          <w:insideH w:val="none" w:color="FFFFFF" w:sz="0"/>
+          <w:insideV w:val="none" w:color="FFFFFF" w:sz="0"/>
+        </w:tblBorders>
+      </w:tblPr>
+      <w:tblGrid>
+        <w:gridCol w:w="1500"/>
+        <w:gridCol w:w="7572"/>
+      </w:tblGrid>
+      <w:tr>
+        <w:trPr>
+          <w:cantSplit/>
+        </w:trPr>
+        <w:tc>
+          <w:tcPr>
+            <w:tcW w:type="dxa" w:w="1500"/>
+            <w:tcBorders>
+              <w:top w:val="none" w:color="FFFFFF" w:sz="0"/>
+              <w:left w:val="none" w:color="FFFFFF" w:sz="0"/>
+              <w:bottom w:val="none" w:color="FFFFFF" w:sz="0"/>
+              <w:right w:val="none" w:color="FFFFFF" w:sz="0"/>
+            </w:tcBorders>
+            <w:tcMar>
+              <w:top w:type="dxa" w:w="40"/>
+              <w:left w:type="dxa" w:w="40"/>
+              <w:bottom w:type="dxa" w:w="40"/>
+              <w:right w:type="dxa" w:w="100"/>
+            </w:tcMar>
+          </w:tcPr>
+          <w:p>
+            <w:pPr>
+              <w:spacing w:after="60" w:before="40"/>
+              <w:jc w:val="center"/>
+            </w:pPr>
+            <w:r>
+              <w:drawing>
+                <wp:inline distT="0" distB="0" distL="0" distR="0">
+                  <wp:extent cx="628650" cy="628650"/>
+                  <wp:effectExtent t="0" r="0" b="0" l="0"/>
+                  <wp:docPr id="1" name="html5" descr="Logo html5" title="html5"/>
+                  <wp:cNvGraphicFramePr>
+                    <a:graphicFrameLocks xmlns:a="http://schemas.openxmlformats.org/drawingml/2006/main" noChangeAspect="1"/>
+                  </wp:cNvGraphicFramePr>
+                  <a:graphic xmlns:a="http://schemas.openxmlformats.org/drawingml/2006/main">
+                    <a:graphicData uri="http://schemas.openxmlformats.org/drawingml/2006/picture">
+                      <pic:pic xmlns:pic="http://schemas.openxmlformats.org/drawingml/2006/picture">
+                        <pic:nvPicPr>
+                          <pic:cNvPr id="0" name="" descr=""/>
+                          <pic:cNvPicPr>
+                            <a:picLocks noChangeAspect="1" noChangeArrowheads="1"/>
+                          </pic:cNvPicPr>
+                        </pic:nvPicPr>
+                        <pic:blipFill>
+                          <a:blip r:embed="rId21" cstate="none"/>
+                          <a:srcRect/>
+                          <a:stretch>
+                            <a:fillRect/>
+                          </a:stretch>
+                        </pic:blipFill>
+                        <pic:spPr bwMode="auto">
+                          <a:xfrm>
+                            <a:off x="0" y="0"/>
+                            <a:ext cx="628650" cy="628650"/>
+                          </a:xfrm>
+                          <a:prstGeom prst="rect">
+                            <a:avLst/>
+                          </a:prstGeom>
+                        </pic:spPr>
+                      </pic:pic>
+                    </a:graphicData>
+                  </a:graphic>
+                </wp:inline>
+              </w:drawing>
+            </w:r>
+          </w:p>
+        </w:tc>
+        <w:tc>
+          <w:tcPr>
+            <w:tcW w:type="dxa" w:w="7572"/>
+            <w:tcBorders>
+              <w:top w:val="none" w:color="FFFFFF" w:sz="0"/>
+              <w:left w:val="none" w:color="FFFFFF" w:sz="0"/>
+              <w:bottom w:val="none" w:color="FFFFFF" w:sz="0"/>
+              <w:right w:val="none" w:color="FFFFFF" w:sz="0"/>
+            </w:tcBorders>
+            <w:tcMar>
+              <w:top w:type="dxa" w:w="40"/>
+              <w:left w:type="dxa" w:w="100"/>
+              <w:bottom w:type="dxa" w:w="40"/>
+              <w:right w:type="dxa" w:w="40"/>
+            </w:tcMar>
+          </w:tcPr>
+          <w:p>
+            <w:pPr>
+              <w:spacing w:after="140" w:line="300"/>
+              <w:jc w:val="both"/>
+            </w:pPr>
+            <w:r>
+              <w:rPr>
+                <w:b/>
+                <w:bCs/>
+              </w:rPr>
+              <w:t xml:space="preserve">1. HTML</w:t>
+            </w:r>
+          </w:p>
+          <w:p>
+            <w:pPr>
+              <w:spacing w:after="140" w:line="300"/>
+              <w:jc w:val="both"/>
+            </w:pPr>
+            <w:r>
+              <w:t xml:space="preserve">HTML (HyperText Markup Language) est un langage de balisage utilisé pour structurer le contenu des pages web : titres, paragraphes, tableaux, formulaires et images. Il a été inventé au début des années 1990 par Tim Berners-Lee. Chaque écran de la plateforme, du formulaire de connexion aux tableaux de dossiers, est une page HTML.</w:t>
+            </w:r>
+          </w:p>
+        </w:tc>
+      </w:tr>
+    </w:tbl>
+    <w:tbl>
+      <w:tblPr>
+        <w:tblW w:type="dxa" w:w="9072"/>
+        <w:tblBorders>
+          <w:top w:val="none" w:color="FFFFFF" w:sz="0"/>
+          <w:left w:val="none" w:color="FFFFFF" w:sz="0"/>
+          <w:bottom w:val="none" w:color="FFFFFF" w:sz="0"/>
+          <w:right w:val="none" w:color="FFFFFF" w:sz="0"/>
+          <w:insideH w:val="none" w:color="FFFFFF" w:sz="0"/>
+          <w:insideV w:val="none" w:color="FFFFFF" w:sz="0"/>
+        </w:tblBorders>
+      </w:tblPr>
+      <w:tblGrid>
+        <w:gridCol w:w="1500"/>
+        <w:gridCol w:w="7572"/>
+      </w:tblGrid>
+      <w:tr>
+        <w:trPr>
+          <w:cantSplit/>
+        </w:trPr>
+        <w:tc>
+          <w:tcPr>
+            <w:tcW w:type="dxa" w:w="1500"/>
+            <w:tcBorders>
+              <w:top w:val="none" w:color="FFFFFF" w:sz="0"/>
+              <w:left w:val="none" w:color="FFFFFF" w:sz="0"/>
+              <w:bottom w:val="none" w:color="FFFFFF" w:sz="0"/>
+              <w:right w:val="none" w:color="FFFFFF" w:sz="0"/>
+            </w:tcBorders>
+            <w:tcMar>
+              <w:top w:type="dxa" w:w="40"/>
+              <w:left w:type="dxa" w:w="40"/>
+              <w:bottom w:type="dxa" w:w="40"/>
+              <w:right w:type="dxa" w:w="100"/>
+            </w:tcMar>
+          </w:tcPr>
+          <w:p>
+            <w:pPr>
+              <w:spacing w:after="60" w:before="40"/>
+              <w:jc w:val="center"/>
+            </w:pPr>
+            <w:r>
+              <w:drawing>
+                <wp:inline distT="0" distB="0" distL="0" distR="0">
+                  <wp:extent cx="628650" cy="628650"/>
+                  <wp:effectExtent t="0" r="0" b="0" l="0"/>
+                  <wp:docPr id="1" name="css3" descr="Logo css3" title="css3"/>
+                  <wp:cNvGraphicFramePr>
+                    <a:graphicFrameLocks xmlns:a="http://schemas.openxmlformats.org/drawingml/2006/main" noChangeAspect="1"/>
+                  </wp:cNvGraphicFramePr>
+                  <a:graphic xmlns:a="http://schemas.openxmlformats.org/drawingml/2006/main">
+                    <a:graphicData uri="http://schemas.openxmlformats.org/drawingml/2006/picture">
+                      <pic:pic xmlns:pic="http://schemas.openxmlformats.org/drawingml/2006/picture">
+                        <pic:nvPicPr>
+                          <pic:cNvPr id="0" name="" descr=""/>
+                          <pic:cNvPicPr>
+                            <a:picLocks noChangeAspect="1" noChangeArrowheads="1"/>
+                          </pic:cNvPicPr>
+                        </pic:nvPicPr>
+                        <pic:blipFill>
+                          <a:blip r:embed="rId22" cstate="none"/>
+                          <a:srcRect/>
+                          <a:stretch>
+                            <a:fillRect/>
+                          </a:stretch>
+                        </pic:blipFill>
+                        <pic:spPr bwMode="auto">
+                          <a:xfrm>
+                            <a:off x="0" y="0"/>
+                            <a:ext cx="628650" cy="628650"/>
+                          </a:xfrm>
+                          <a:prstGeom prst="rect">
+                            <a:avLst/>
+                          </a:prstGeom>
+                        </pic:spPr>
+                      </pic:pic>
+                    </a:graphicData>
+                  </a:graphic>
+                </wp:inline>
+              </w:drawing>
+            </w:r>
+          </w:p>
+        </w:tc>
+        <w:tc>
+          <w:tcPr>
+            <w:tcW w:type="dxa" w:w="7572"/>
+            <w:tcBorders>
+              <w:top w:val="none" w:color="FFFFFF" w:sz="0"/>
+              <w:left w:val="none" w:color="FFFFFF" w:sz="0"/>
+              <w:bottom w:val="none" w:color="FFFFFF" w:sz="0"/>
+              <w:right w:val="none" w:color="FFFFFF" w:sz="0"/>
+            </w:tcBorders>
+            <w:tcMar>
+              <w:top w:type="dxa" w:w="40"/>
+              <w:left w:type="dxa" w:w="100"/>
+              <w:bottom w:type="dxa" w:w="40"/>
+              <w:right w:type="dxa" w:w="40"/>
+            </w:tcMar>
+          </w:tcPr>
+          <w:p>
+            <w:pPr>
+              <w:spacing w:after="140" w:line="300"/>
+              <w:jc w:val="both"/>
+            </w:pPr>
+            <w:r>
+              <w:rPr>
+                <w:b/>
+                <w:bCs/>
+              </w:rPr>
+              <w:t xml:space="preserve">2. CSS</w:t>
+            </w:r>
+          </w:p>
+          <w:p>
+            <w:pPr>
+              <w:spacing w:after="140" w:line="300"/>
+              <w:jc w:val="both"/>
+            </w:pPr>
+            <w:r>
+              <w:t xml:space="preserve">CSS (Cascading Style Sheets) est un langage de style pour les pages web. Il contrôle l'apparence des éléments : couleurs, polices, marges et disposition. Il donne à la plateforme un style sobre et cohérent, avec les couleurs du drapeau ivoirien en bandeau et un affichage adapté aux écrans de téléphone comme d'ordinateur.</w:t>
+            </w:r>
+          </w:p>
+        </w:tc>
+      </w:tr>
+    </w:tbl>
+    <w:tbl>
+      <w:tblPr>
+        <w:tblW w:type="dxa" w:w="9072"/>
+        <w:tblBorders>
+          <w:top w:val="none" w:color="FFFFFF" w:sz="0"/>
+          <w:left w:val="none" w:color="FFFFFF" w:sz="0"/>
+          <w:bottom w:val="none" w:color="FFFFFF" w:sz="0"/>
+          <w:right w:val="none" w:color="FFFFFF" w:sz="0"/>
+          <w:insideH w:val="none" w:color="FFFFFF" w:sz="0"/>
+          <w:insideV w:val="none" w:color="FFFFFF" w:sz="0"/>
+        </w:tblBorders>
+      </w:tblPr>
+      <w:tblGrid>
+        <w:gridCol w:w="1500"/>
+        <w:gridCol w:w="7572"/>
+      </w:tblGrid>
+      <w:tr>
+        <w:trPr>
+          <w:cantSplit/>
+        </w:trPr>
+        <w:tc>
+          <w:tcPr>
+            <w:tcW w:type="dxa" w:w="1500"/>
+            <w:tcBorders>
+              <w:top w:val="none" w:color="FFFFFF" w:sz="0"/>
+              <w:left w:val="none" w:color="FFFFFF" w:sz="0"/>
+              <w:bottom w:val="none" w:color="FFFFFF" w:sz="0"/>
+              <w:right w:val="none" w:color="FFFFFF" w:sz="0"/>
+            </w:tcBorders>
+            <w:tcMar>
+              <w:top w:type="dxa" w:w="40"/>
+              <w:left w:type="dxa" w:w="40"/>
+              <w:bottom w:type="dxa" w:w="40"/>
+              <w:right w:type="dxa" w:w="100"/>
+            </w:tcMar>
+          </w:tcPr>
+          <w:p>
+            <w:pPr>
+              <w:spacing w:after="60" w:before="40"/>
+              <w:jc w:val="center"/>
+            </w:pPr>
+            <w:r>
+              <w:drawing>
+                <wp:inline distT="0" distB="0" distL="0" distR="0">
+                  <wp:extent cx="628650" cy="628650"/>
+                  <wp:effectExtent t="0" r="0" b="0" l="0"/>
+                  <wp:docPr id="1" name="javascript" descr="Logo javascript" title="javascript"/>
+                  <wp:cNvGraphicFramePr>
+                    <a:graphicFrameLocks xmlns:a="http://schemas.openxmlformats.org/drawingml/2006/main" noChangeAspect="1"/>
+                  </wp:cNvGraphicFramePr>
+                  <a:graphic xmlns:a="http://schemas.openxmlformats.org/drawingml/2006/main">
+                    <a:graphicData uri="http://schemas.openxmlformats.org/drawingml/2006/picture">
+                      <pic:pic xmlns:pic="http://schemas.openxmlformats.org/drawingml/2006/picture">
+                        <pic:nvPicPr>
+                          <pic:cNvPr id="0" name="" descr=""/>
+                          <pic:cNvPicPr>
+                            <a:picLocks noChangeAspect="1" noChangeArrowheads="1"/>
+                          </pic:cNvPicPr>
+                        </pic:nvPicPr>
+                        <pic:blipFill>
+                          <a:blip r:embed="rId23" cstate="none"/>
+                          <a:srcRect/>
+                          <a:stretch>
+                            <a:fillRect/>
+                          </a:stretch>
+                        </pic:blipFill>
+                        <pic:spPr bwMode="auto">
+                          <a:xfrm>
+                            <a:off x="0" y="0"/>
+                            <a:ext cx="628650" cy="628650"/>
+                          </a:xfrm>
+                          <a:prstGeom prst="rect">
+                            <a:avLst/>
+                          </a:prstGeom>
+                        </pic:spPr>
+                      </pic:pic>
+                    </a:graphicData>
+                  </a:graphic>
+                </wp:inline>
+              </w:drawing>
+            </w:r>
+          </w:p>
+        </w:tc>
+        <w:tc>
+          <w:tcPr>
+            <w:tcW w:type="dxa" w:w="7572"/>
+            <w:tcBorders>
+              <w:top w:val="none" w:color="FFFFFF" w:sz="0"/>
+              <w:left w:val="none" w:color="FFFFFF" w:sz="0"/>
+              <w:bottom w:val="none" w:color="FFFFFF" w:sz="0"/>
+              <w:right w:val="none" w:color="FFFFFF" w:sz="0"/>
+            </w:tcBorders>
+            <w:tcMar>
+              <w:top w:type="dxa" w:w="40"/>
+              <w:left w:type="dxa" w:w="100"/>
+              <w:bottom w:type="dxa" w:w="40"/>
+              <w:right w:type="dxa" w:w="40"/>
+            </w:tcMar>
+          </w:tcPr>
+          <w:p>
+            <w:pPr>
+              <w:spacing w:after="140" w:line="300"/>
+              <w:jc w:val="both"/>
+            </w:pPr>
+            <w:r>
+              <w:rPr>
+                <w:b/>
+                <w:bCs/>
+              </w:rPr>
+              <w:t xml:space="preserve">3. JavaScript</w:t>
+            </w:r>
+          </w:p>
+          <w:p>
+            <w:pPr>
+              <w:spacing w:after="140" w:line="300"/>
+              <w:jc w:val="both"/>
+            </w:pPr>
+            <w:r>
+              <w:t xml:space="preserve">JavaScript est le langage qui rend les pages web interactives. Il réagit aux actions de l'utilisateur, envoie des requêtes au serveur sans recharger la page et met à jour le contenu affiché. Dans notre application, il affiche les listes de dossiers, envoie les formulaires, gère les notifications et dessine les graphiques du tableau de bord grâce à la bibliothèque Chart.js. Il fonctionne dans tous les navigateurs actuels.</w:t>
+            </w:r>
+          </w:p>
+        </w:tc>
+      </w:tr>
+    </w:tbl>
+    <w:tbl>
+      <w:tblPr>
+        <w:tblW w:type="dxa" w:w="9072"/>
+        <w:tblBorders>
+          <w:top w:val="none" w:color="FFFFFF" w:sz="0"/>
+          <w:left w:val="none" w:color="FFFFFF" w:sz="0"/>
+          <w:bottom w:val="none" w:color="FFFFFF" w:sz="0"/>
+          <w:right w:val="none" w:color="FFFFFF" w:sz="0"/>
+          <w:insideH w:val="none" w:color="FFFFFF" w:sz="0"/>
+          <w:insideV w:val="none" w:color="FFFFFF" w:sz="0"/>
+        </w:tblBorders>
+      </w:tblPr>
+      <w:tblGrid>
+        <w:gridCol w:w="1500"/>
+        <w:gridCol w:w="7572"/>
+      </w:tblGrid>
+      <w:tr>
+        <w:trPr>
+          <w:cantSplit/>
+        </w:trPr>
+        <w:tc>
+          <w:tcPr>
+            <w:tcW w:type="dxa" w:w="1500"/>
+            <w:tcBorders>
+              <w:top w:val="none" w:color="FFFFFF" w:sz="0"/>
+              <w:left w:val="none" w:color="FFFFFF" w:sz="0"/>
+              <w:bottom w:val="none" w:color="FFFFFF" w:sz="0"/>
+              <w:right w:val="none" w:color="FFFFFF" w:sz="0"/>
+            </w:tcBorders>
+            <w:tcMar>
+              <w:top w:type="dxa" w:w="40"/>
+              <w:left w:type="dxa" w:w="40"/>
+              <w:bottom w:type="dxa" w:w="40"/>
+              <w:right w:type="dxa" w:w="100"/>
+            </w:tcMar>
+          </w:tcPr>
+          <w:p>
+            <w:pPr>
+              <w:spacing w:after="60" w:before="40"/>
+              <w:jc w:val="center"/>
+            </w:pPr>
+            <w:r>
+              <w:drawing>
+                <wp:inline distT="0" distB="0" distL="0" distR="0">
+                  <wp:extent cx="628650" cy="628650"/>
+                  <wp:effectExtent t="0" r="0" b="0" l="0"/>
+                  <wp:docPr id="1" name="php" descr="Logo php" title="php"/>
+                  <wp:cNvGraphicFramePr>
+                    <a:graphicFrameLocks xmlns:a="http://schemas.openxmlformats.org/drawingml/2006/main" noChangeAspect="1"/>
+                  </wp:cNvGraphicFramePr>
+                  <a:graphic xmlns:a="http://schemas.openxmlformats.org/drawingml/2006/main">
+                    <a:graphicData uri="http://schemas.openxmlformats.org/drawingml/2006/picture">
+                      <pic:pic xmlns:pic="http://schemas.openxmlformats.org/drawingml/2006/picture">
+                        <pic:nvPicPr>
+                          <pic:cNvPr id="0" name="" descr=""/>
+                          <pic:cNvPicPr>
+                            <a:picLocks noChangeAspect="1" noChangeArrowheads="1"/>
+                          </pic:cNvPicPr>
+                        </pic:nvPicPr>
+                        <pic:blipFill>
+                          <a:blip r:embed="rId24" cstate="none"/>
+                          <a:srcRect/>
+                          <a:stretch>
+                            <a:fillRect/>
+                          </a:stretch>
+                        </pic:blipFill>
+                        <pic:spPr bwMode="auto">
+                          <a:xfrm>
+                            <a:off x="0" y="0"/>
+                            <a:ext cx="628650" cy="628650"/>
+                          </a:xfrm>
+                          <a:prstGeom prst="rect">
+                            <a:avLst/>
+                          </a:prstGeom>
+                        </pic:spPr>
+                      </pic:pic>
+                    </a:graphicData>
+                  </a:graphic>
+                </wp:inline>
+              </w:drawing>
+            </w:r>
+          </w:p>
+        </w:tc>
+        <w:tc>
+          <w:tcPr>
+            <w:tcW w:type="dxa" w:w="7572"/>
+            <w:tcBorders>
+              <w:top w:val="none" w:color="FFFFFF" w:sz="0"/>
+              <w:left w:val="none" w:color="FFFFFF" w:sz="0"/>
+              <w:bottom w:val="none" w:color="FFFFFF" w:sz="0"/>
+              <w:right w:val="none" w:color="FFFFFF" w:sz="0"/>
+            </w:tcBorders>
+            <w:tcMar>
+              <w:top w:type="dxa" w:w="40"/>
+              <w:left w:type="dxa" w:w="100"/>
+              <w:bottom w:type="dxa" w:w="40"/>
+              <w:right w:type="dxa" w:w="40"/>
+            </w:tcMar>
+          </w:tcPr>
+          <w:p>
+            <w:pPr>
+              <w:spacing w:after="140" w:line="300"/>
+              <w:jc w:val="both"/>
+            </w:pPr>
+            <w:r>
+              <w:rPr>
+                <w:b/>
+                <w:bCs/>
+              </w:rPr>
+              <w:t xml:space="preserve">4. PHP</w:t>
+            </w:r>
+          </w:p>
+          <w:p>
+            <w:pPr>
+              <w:spacing w:after="140" w:line="300"/>
+              <w:jc w:val="both"/>
+            </w:pPr>
+            <w:r>
+              <w:t xml:space="preserve">PHP, qui signifie « PHP: Hypertext Preprocessor », est un langage de programmation web polyvalent et très répandu, créé par Rasmus Lerdorf au milieu des années 1990. Il s'exécute sur le serveur : il reçoit les demandes, applique les règles de l'application, dialogue avec la base de données et renvoie la réponse. Il bénéficie d'une grande communauté de développeurs et il est pris en charge par presque tous les hébergeurs. Nous utilisons la version 8.5, qui permet de typer les données échangées entre les fonctions et évite ainsi de nombreuses erreurs.</w:t>
+            </w:r>
+          </w:p>
+        </w:tc>
+      </w:tr>
+    </w:tbl>
     <w:p>
       <w:pPr>
         <w:pStyle w:val="Heading3"/>
@@ -4144,50 +5256,254 @@
         <w:t xml:space="preserve">2.7. Frameworks utilisés</w:t>
       </w:r>
     </w:p>
-    <w:p>
-      <w:pPr>
-        <w:spacing w:after="140" w:line="300"/>
-        <w:jc w:val="both"/>
-      </w:pPr>
-      <w:r>
-        <w:rPr>
-          <w:b/>
-          <w:bCs/>
-        </w:rPr>
-        <w:t xml:space="preserve">1. Tailwind CSS</w:t>
-      </w:r>
-    </w:p>
-    <w:p>
-      <w:pPr>
-        <w:spacing w:after="140" w:line="300"/>
-        <w:jc w:val="both"/>
-      </w:pPr>
-      <w:r>
-        <w:t xml:space="preserve">Tailwind CSS est un cadre de développement pour le style des pages, qui fournit de petites classes prêtes à l'emploi (couleurs, espacements, tailles, alignements) que l'on combine directement dans le code HTML. Il permet de construire rapidement des mises en page modernes et adaptées à tous les écrans, sans écrire de longues feuilles de style. Nous l'avons retenu pour l'homogénéité de l'interface : tous les espaces de la plateforme partagent les mêmes couleurs, les mêmes boutons et les mêmes tableaux.</w:t>
-      </w:r>
-    </w:p>
-    <w:p>
-      <w:pPr>
-        <w:spacing w:after="140" w:line="300"/>
-        <w:jc w:val="both"/>
-      </w:pPr>
-      <w:r>
-        <w:rPr>
-          <w:b/>
-          <w:bCs/>
-        </w:rPr>
-        <w:t xml:space="preserve">2. Laravel</w:t>
-      </w:r>
-    </w:p>
-    <w:p>
-      <w:pPr>
-        <w:spacing w:after="140" w:line="300"/>
-        <w:jc w:val="both"/>
-      </w:pPr>
-      <w:r>
-        <w:t xml:space="preserve">Laravel est un cadre de développement PHP libre, créé en 2011 par Taylor Otwell et très utilisé pour les applications web et les API. Il repose sur une architecture MVC (Modèle, Vue, Contrôleur) et s'appuie sur plusieurs composants du cadre Symfony. Il propose de nombreuses fonctionnalités prêtes à l'emploi : gestion des routes, validation des formulaires, authentification des utilisateurs, accès à la base de données avec l'outil Eloquent, migrations, notifications et envoi d'emails. Nous utilisons la version 13. Il est choisi par de nombreux développeurs pour sa clarté, sa sécurité et sa communauté active.</w:t>
-      </w:r>
-    </w:p>
+    <w:tbl>
+      <w:tblPr>
+        <w:tblW w:type="dxa" w:w="9072"/>
+        <w:tblBorders>
+          <w:top w:val="none" w:color="FFFFFF" w:sz="0"/>
+          <w:left w:val="none" w:color="FFFFFF" w:sz="0"/>
+          <w:bottom w:val="none" w:color="FFFFFF" w:sz="0"/>
+          <w:right w:val="none" w:color="FFFFFF" w:sz="0"/>
+          <w:insideH w:val="none" w:color="FFFFFF" w:sz="0"/>
+          <w:insideV w:val="none" w:color="FFFFFF" w:sz="0"/>
+        </w:tblBorders>
+      </w:tblPr>
+      <w:tblGrid>
+        <w:gridCol w:w="1500"/>
+        <w:gridCol w:w="7572"/>
+      </w:tblGrid>
+      <w:tr>
+        <w:trPr>
+          <w:cantSplit/>
+        </w:trPr>
+        <w:tc>
+          <w:tcPr>
+            <w:tcW w:type="dxa" w:w="1500"/>
+            <w:tcBorders>
+              <w:top w:val="none" w:color="FFFFFF" w:sz="0"/>
+              <w:left w:val="none" w:color="FFFFFF" w:sz="0"/>
+              <w:bottom w:val="none" w:color="FFFFFF" w:sz="0"/>
+              <w:right w:val="none" w:color="FFFFFF" w:sz="0"/>
+            </w:tcBorders>
+            <w:tcMar>
+              <w:top w:type="dxa" w:w="40"/>
+              <w:left w:type="dxa" w:w="40"/>
+              <w:bottom w:type="dxa" w:w="40"/>
+              <w:right w:type="dxa" w:w="100"/>
+            </w:tcMar>
+          </w:tcPr>
+          <w:p>
+            <w:pPr>
+              <w:spacing w:after="60" w:before="40"/>
+              <w:jc w:val="center"/>
+            </w:pPr>
+            <w:r>
+              <w:drawing>
+                <wp:inline distT="0" distB="0" distL="0" distR="0">
+                  <wp:extent cx="628650" cy="628650"/>
+                  <wp:effectExtent t="0" r="0" b="0" l="0"/>
+                  <wp:docPr id="1" name="tailwindcss" descr="Logo tailwindcss" title="tailwindcss"/>
+                  <wp:cNvGraphicFramePr>
+                    <a:graphicFrameLocks xmlns:a="http://schemas.openxmlformats.org/drawingml/2006/main" noChangeAspect="1"/>
+                  </wp:cNvGraphicFramePr>
+                  <a:graphic xmlns:a="http://schemas.openxmlformats.org/drawingml/2006/main">
+                    <a:graphicData uri="http://schemas.openxmlformats.org/drawingml/2006/picture">
+                      <pic:pic xmlns:pic="http://schemas.openxmlformats.org/drawingml/2006/picture">
+                        <pic:nvPicPr>
+                          <pic:cNvPr id="0" name="" descr=""/>
+                          <pic:cNvPicPr>
+                            <a:picLocks noChangeAspect="1" noChangeArrowheads="1"/>
+                          </pic:cNvPicPr>
+                        </pic:nvPicPr>
+                        <pic:blipFill>
+                          <a:blip r:embed="rId25" cstate="none"/>
+                          <a:srcRect/>
+                          <a:stretch>
+                            <a:fillRect/>
+                          </a:stretch>
+                        </pic:blipFill>
+                        <pic:spPr bwMode="auto">
+                          <a:xfrm>
+                            <a:off x="0" y="0"/>
+                            <a:ext cx="628650" cy="628650"/>
+                          </a:xfrm>
+                          <a:prstGeom prst="rect">
+                            <a:avLst/>
+                          </a:prstGeom>
+                        </pic:spPr>
+                      </pic:pic>
+                    </a:graphicData>
+                  </a:graphic>
+                </wp:inline>
+              </w:drawing>
+            </w:r>
+          </w:p>
+        </w:tc>
+        <w:tc>
+          <w:tcPr>
+            <w:tcW w:type="dxa" w:w="7572"/>
+            <w:tcBorders>
+              <w:top w:val="none" w:color="FFFFFF" w:sz="0"/>
+              <w:left w:val="none" w:color="FFFFFF" w:sz="0"/>
+              <w:bottom w:val="none" w:color="FFFFFF" w:sz="0"/>
+              <w:right w:val="none" w:color="FFFFFF" w:sz="0"/>
+            </w:tcBorders>
+            <w:tcMar>
+              <w:top w:type="dxa" w:w="40"/>
+              <w:left w:type="dxa" w:w="100"/>
+              <w:bottom w:type="dxa" w:w="40"/>
+              <w:right w:type="dxa" w:w="40"/>
+            </w:tcMar>
+          </w:tcPr>
+          <w:p>
+            <w:pPr>
+              <w:spacing w:after="140" w:line="300"/>
+              <w:jc w:val="both"/>
+            </w:pPr>
+            <w:r>
+              <w:rPr>
+                <w:b/>
+                <w:bCs/>
+              </w:rPr>
+              <w:t xml:space="preserve">1. Tailwind CSS</w:t>
+            </w:r>
+          </w:p>
+          <w:p>
+            <w:pPr>
+              <w:spacing w:after="140" w:line="300"/>
+              <w:jc w:val="both"/>
+            </w:pPr>
+            <w:r>
+              <w:t xml:space="preserve">Tailwind CSS est un cadre de développement pour le style des pages, qui fournit de petites classes prêtes à l'emploi (couleurs, espacements, tailles, alignements) que l'on combine directement dans le code HTML. Il permet de construire rapidement des mises en page modernes et adaptées à tous les écrans, sans écrire de longues feuilles de style. Nous l'avons retenu pour l'homogénéité de l'interface : tous les espaces de la plateforme partagent les mêmes couleurs, les mêmes boutons et les mêmes tableaux.</w:t>
+            </w:r>
+          </w:p>
+        </w:tc>
+      </w:tr>
+    </w:tbl>
+    <w:tbl>
+      <w:tblPr>
+        <w:tblW w:type="dxa" w:w="9072"/>
+        <w:tblBorders>
+          <w:top w:val="none" w:color="FFFFFF" w:sz="0"/>
+          <w:left w:val="none" w:color="FFFFFF" w:sz="0"/>
+          <w:bottom w:val="none" w:color="FFFFFF" w:sz="0"/>
+          <w:right w:val="none" w:color="FFFFFF" w:sz="0"/>
+          <w:insideH w:val="none" w:color="FFFFFF" w:sz="0"/>
+          <w:insideV w:val="none" w:color="FFFFFF" w:sz="0"/>
+        </w:tblBorders>
+      </w:tblPr>
+      <w:tblGrid>
+        <w:gridCol w:w="1500"/>
+        <w:gridCol w:w="7572"/>
+      </w:tblGrid>
+      <w:tr>
+        <w:trPr>
+          <w:cantSplit/>
+        </w:trPr>
+        <w:tc>
+          <w:tcPr>
+            <w:tcW w:type="dxa" w:w="1500"/>
+            <w:tcBorders>
+              <w:top w:val="none" w:color="FFFFFF" w:sz="0"/>
+              <w:left w:val="none" w:color="FFFFFF" w:sz="0"/>
+              <w:bottom w:val="none" w:color="FFFFFF" w:sz="0"/>
+              <w:right w:val="none" w:color="FFFFFF" w:sz="0"/>
+            </w:tcBorders>
+            <w:tcMar>
+              <w:top w:type="dxa" w:w="40"/>
+              <w:left w:type="dxa" w:w="40"/>
+              <w:bottom w:type="dxa" w:w="40"/>
+              <w:right w:type="dxa" w:w="100"/>
+            </w:tcMar>
+          </w:tcPr>
+          <w:p>
+            <w:pPr>
+              <w:spacing w:after="60" w:before="40"/>
+              <w:jc w:val="center"/>
+            </w:pPr>
+            <w:r>
+              <w:drawing>
+                <wp:inline distT="0" distB="0" distL="0" distR="0">
+                  <wp:extent cx="628650" cy="628650"/>
+                  <wp:effectExtent t="0" r="0" b="0" l="0"/>
+                  <wp:docPr id="1" name="laravel" descr="Logo laravel" title="laravel"/>
+                  <wp:cNvGraphicFramePr>
+                    <a:graphicFrameLocks xmlns:a="http://schemas.openxmlformats.org/drawingml/2006/main" noChangeAspect="1"/>
+                  </wp:cNvGraphicFramePr>
+                  <a:graphic xmlns:a="http://schemas.openxmlformats.org/drawingml/2006/main">
+                    <a:graphicData uri="http://schemas.openxmlformats.org/drawingml/2006/picture">
+                      <pic:pic xmlns:pic="http://schemas.openxmlformats.org/drawingml/2006/picture">
+                        <pic:nvPicPr>
+                          <pic:cNvPr id="0" name="" descr=""/>
+                          <pic:cNvPicPr>
+                            <a:picLocks noChangeAspect="1" noChangeArrowheads="1"/>
+                          </pic:cNvPicPr>
+                        </pic:nvPicPr>
+                        <pic:blipFill>
+                          <a:blip r:embed="rId26" cstate="none"/>
+                          <a:srcRect/>
+                          <a:stretch>
+                            <a:fillRect/>
+                          </a:stretch>
+                        </pic:blipFill>
+                        <pic:spPr bwMode="auto">
+                          <a:xfrm>
+                            <a:off x="0" y="0"/>
+                            <a:ext cx="628650" cy="628650"/>
+                          </a:xfrm>
+                          <a:prstGeom prst="rect">
+                            <a:avLst/>
+                          </a:prstGeom>
+                        </pic:spPr>
+                      </pic:pic>
+                    </a:graphicData>
+                  </a:graphic>
+                </wp:inline>
+              </w:drawing>
+            </w:r>
+          </w:p>
+        </w:tc>
+        <w:tc>
+          <w:tcPr>
+            <w:tcW w:type="dxa" w:w="7572"/>
+            <w:tcBorders>
+              <w:top w:val="none" w:color="FFFFFF" w:sz="0"/>
+              <w:left w:val="none" w:color="FFFFFF" w:sz="0"/>
+              <w:bottom w:val="none" w:color="FFFFFF" w:sz="0"/>
+              <w:right w:val="none" w:color="FFFFFF" w:sz="0"/>
+            </w:tcBorders>
+            <w:tcMar>
+              <w:top w:type="dxa" w:w="40"/>
+              <w:left w:type="dxa" w:w="100"/>
+              <w:bottom w:type="dxa" w:w="40"/>
+              <w:right w:type="dxa" w:w="40"/>
+            </w:tcMar>
+          </w:tcPr>
+          <w:p>
+            <w:pPr>
+              <w:spacing w:after="140" w:line="300"/>
+              <w:jc w:val="both"/>
+            </w:pPr>
+            <w:r>
+              <w:rPr>
+                <w:b/>
+                <w:bCs/>
+              </w:rPr>
+              <w:t xml:space="preserve">2. Laravel</w:t>
+            </w:r>
+          </w:p>
+          <w:p>
+            <w:pPr>
+              <w:spacing w:after="140" w:line="300"/>
+              <w:jc w:val="both"/>
+            </w:pPr>
+            <w:r>
+              <w:t xml:space="preserve">Laravel est un cadre de développement PHP libre, créé en 2011 par Taylor Otwell et très utilisé pour les applications web et les API. Il repose sur une architecture MVC (Modèle, Vue, Contrôleur) et s'appuie sur plusieurs composants du cadre Symfony. Il propose de nombreuses fonctionnalités prêtes à l'emploi : gestion des routes, validation des formulaires, authentification des utilisateurs, accès à la base de données avec l'outil Eloquent, migrations, notifications et envoi d'emails. Nous utilisons la version 13. Il est choisi par de nombreux développeurs pour sa clarté, sa sécurité et sa communauté active.</w:t>
+            </w:r>
+          </w:p>
+        </w:tc>
+      </w:tr>
+    </w:tbl>
     <w:p>
       <w:pPr>
         <w:spacing w:after="140" w:line="300"/>
@@ -4222,7 +5538,7 @@
                     </pic:cNvPicPr>
                   </pic:nvPicPr>
                   <pic:blipFill>
-                    <a:blip r:embed="rId13" cstate="none"/>
+                    <a:blip r:embed="rId27" cstate="none"/>
                     <a:srcRect/>
                     <a:stretch>
                       <a:fillRect/>
@@ -4443,7 +5759,7 @@
                     </pic:cNvPicPr>
                   </pic:nvPicPr>
                   <pic:blipFill>
-                    <a:blip r:embed="rId14" cstate="none"/>
+                    <a:blip r:embed="rId28" cstate="none"/>
                     <a:srcRect/>
                     <a:stretch>
                       <a:fillRect/>
@@ -4505,7 +5821,7 @@
                     </pic:cNvPicPr>
                   </pic:nvPicPr>
                   <pic:blipFill>
-                    <a:blip r:embed="rId15" cstate="none"/>
+                    <a:blip r:embed="rId29" cstate="none"/>
                     <a:srcRect/>
                     <a:stretch>
                       <a:fillRect/>
@@ -4567,7 +5883,7 @@
                     </pic:cNvPicPr>
                   </pic:nvPicPr>
                   <pic:blipFill>
-                    <a:blip r:embed="rId16" cstate="none"/>
+                    <a:blip r:embed="rId30" cstate="none"/>
                     <a:srcRect/>
                     <a:stretch>
                       <a:fillRect/>
@@ -4629,7 +5945,7 @@
                     </pic:cNvPicPr>
                   </pic:nvPicPr>
                   <pic:blipFill>
-                    <a:blip r:embed="rId17" cstate="none"/>
+                    <a:blip r:embed="rId31" cstate="none"/>
                     <a:srcRect/>
                     <a:stretch>
                       <a:fillRect/>

</xml_diff>